<commit_message>
add last requiremtns to submit in forms
</commit_message>
<xml_diff>
--- a/Studex_DEPI_Graduation_Project_Documentation.docx
+++ b/Studex_DEPI_Graduation_Project_Documentation.docx
@@ -2492,31 +2492,10 @@
     </w:sdt>
     <w:p>
       <w:pPr>
-        <w:spacing w:before="200"/>
-      </w:pPr>
-      <w:r>
-        <w:rPr>
-          <w:i/>
-          <w:iCs/>
-          <w:color w:val="888888"/>
-          <w:sz w:val="18"/>
-          <w:szCs w:val="18"/>
-        </w:rPr>
-        <w:t>(Right-click the table above and choose “Update Field” in Word to populate page numbers.)</w:t>
-      </w:r>
-    </w:p>
-    <w:p>
-      <w:r>
-        <w:br w:type="page"/>
-      </w:r>
-    </w:p>
-    <w:p>
-      <w:pPr>
         <w:pStyle w:val="Heading1"/>
       </w:pPr>
       <w:bookmarkStart w:id="1" w:name="_Toc233839607"/>
       <w:r>
-        <w:lastRenderedPageBreak/>
         <w:t>Abstract</w:t>
       </w:r>
       <w:bookmarkEnd w:id="1"/>
@@ -2562,17 +2541,11 @@
       </w:r>
     </w:p>
     <w:p>
-      <w:r>
-        <w:br w:type="page"/>
-      </w:r>
-    </w:p>
-    <w:p>
       <w:pPr>
         <w:pStyle w:val="Heading1"/>
       </w:pPr>
       <w:bookmarkStart w:id="2" w:name="_Toc233839608"/>
       <w:r>
-        <w:lastRenderedPageBreak/>
         <w:t>1. Introduction</w:t>
       </w:r>
       <w:bookmarkEnd w:id="2"/>
@@ -2680,6 +2653,7 @@
           <w:b/>
           <w:bCs/>
         </w:rPr>
+        <w:lastRenderedPageBreak/>
         <w:t xml:space="preserve">Room-based collaboration: </w:t>
       </w:r>
       <w:r>
@@ -2888,7 +2862,6 @@
           <w:b/>
           <w:bCs/>
         </w:rPr>
-        <w:lastRenderedPageBreak/>
         <w:t xml:space="preserve">Teachers — </w:t>
       </w:r>
       <w:r>
@@ -2933,17 +2906,11 @@
       </w:r>
     </w:p>
     <w:p>
-      <w:r>
-        <w:br w:type="page"/>
-      </w:r>
-    </w:p>
-    <w:p>
       <w:pPr>
         <w:pStyle w:val="Heading1"/>
       </w:pPr>
       <w:bookmarkStart w:id="7" w:name="_Toc233839613"/>
       <w:r>
-        <w:lastRenderedPageBreak/>
         <w:t>2. System Design</w:t>
       </w:r>
       <w:bookmarkEnd w:id="7"/>
@@ -2994,11 +2961,12 @@
         <w:rPr>
           <w:noProof/>
         </w:rPr>
+        <w:lastRenderedPageBreak/>
         <w:drawing>
-          <wp:inline distT="0" distB="0" distL="0" distR="0" wp14:anchorId="045C0010" wp14:editId="587B2A72">
-            <wp:extent cx="3868769" cy="2994457"/>
-            <wp:effectExtent l="0" t="0" r="0" b="0"/>
-            <wp:docPr id="1" name="Picture 1"/>
+          <wp:inline distT="0" distB="0" distL="0" distR="0" wp14:anchorId="5D44430F" wp14:editId="1B305F17">
+            <wp:extent cx="5727700" cy="4420235"/>
+            <wp:effectExtent l="0" t="0" r="6350" b="0"/>
+            <wp:docPr id="841016707" name="Picture 53"/>
             <wp:cNvGraphicFramePr>
               <a:graphicFrameLocks xmlns:a="http://schemas.openxmlformats.org/drawingml/2006/main" noChangeAspect="1"/>
             </wp:cNvGraphicFramePr>
@@ -3006,13 +2974,19 @@
               <a:graphicData uri="http://schemas.openxmlformats.org/drawingml/2006/picture">
                 <pic:pic xmlns:pic="http://schemas.openxmlformats.org/drawingml/2006/picture">
                   <pic:nvPicPr>
-                    <pic:cNvPr id="0" name=""/>
+                    <pic:cNvPr id="0" name="Picture 53"/>
                     <pic:cNvPicPr>
                       <a:picLocks noChangeAspect="1" noChangeArrowheads="1"/>
                     </pic:cNvPicPr>
                   </pic:nvPicPr>
                   <pic:blipFill>
-                    <a:blip r:embed="rId8"/>
+                    <a:blip r:embed="rId8" cstate="print">
+                      <a:extLst>
+                        <a:ext uri="{28A0092B-C50C-407E-A947-70E740481C1C}">
+                          <a14:useLocalDpi xmlns:a14="http://schemas.microsoft.com/office/drawing/2010/main" val="0"/>
+                        </a:ext>
+                      </a:extLst>
+                    </a:blip>
                     <a:srcRect/>
                     <a:stretch>
                       <a:fillRect/>
@@ -3021,11 +2995,15 @@
                   <pic:spPr bwMode="auto">
                     <a:xfrm>
                       <a:off x="0" y="0"/>
-                      <a:ext cx="3868769" cy="2994457"/>
+                      <a:ext cx="5727700" cy="4420235"/>
                     </a:xfrm>
                     <a:prstGeom prst="rect">
                       <a:avLst/>
                     </a:prstGeom>
+                    <a:noFill/>
+                    <a:ln>
+                      <a:noFill/>
+                    </a:ln>
                   </pic:spPr>
                 </pic:pic>
               </a:graphicData>
@@ -3206,12 +3184,6 @@
         <w:gridCol w:w="3426"/>
       </w:tblGrid>
       <w:tr>
-        <w:tblPrEx>
-          <w:tblCellMar>
-            <w:top w:w="0" w:type="dxa"/>
-            <w:bottom w:w="0" w:type="dxa"/>
-          </w:tblCellMar>
-        </w:tblPrEx>
         <w:trPr>
           <w:tblHeader/>
         </w:trPr>
@@ -3292,12 +3264,6 @@
         </w:tc>
       </w:tr>
       <w:tr>
-        <w:tblPrEx>
-          <w:tblCellMar>
-            <w:top w:w="0" w:type="dxa"/>
-            <w:bottom w:w="0" w:type="dxa"/>
-          </w:tblCellMar>
-        </w:tblPrEx>
         <w:tc>
           <w:tcPr>
             <w:tcW w:w="2100" w:type="dxa"/>
@@ -3375,12 +3341,6 @@
         </w:tc>
       </w:tr>
       <w:tr>
-        <w:tblPrEx>
-          <w:tblCellMar>
-            <w:top w:w="0" w:type="dxa"/>
-            <w:bottom w:w="0" w:type="dxa"/>
-          </w:tblCellMar>
-        </w:tblPrEx>
         <w:tc>
           <w:tcPr>
             <w:tcW w:w="2100" w:type="dxa"/>
@@ -3399,7 +3359,6 @@
                 <w:sz w:val="20"/>
                 <w:szCs w:val="20"/>
               </w:rPr>
-              <w:lastRenderedPageBreak/>
               <w:t>rooms</w:t>
             </w:r>
           </w:p>
@@ -3475,12 +3434,6 @@
         </w:tc>
       </w:tr>
       <w:tr>
-        <w:tblPrEx>
-          <w:tblCellMar>
-            <w:top w:w="0" w:type="dxa"/>
-            <w:bottom w:w="0" w:type="dxa"/>
-          </w:tblCellMar>
-        </w:tblPrEx>
         <w:tc>
           <w:tcPr>
             <w:tcW w:w="2100" w:type="dxa"/>
@@ -3590,12 +3543,6 @@
         </w:tc>
       </w:tr>
       <w:tr>
-        <w:tblPrEx>
-          <w:tblCellMar>
-            <w:top w:w="0" w:type="dxa"/>
-            <w:bottom w:w="0" w:type="dxa"/>
-          </w:tblCellMar>
-        </w:tblPrEx>
         <w:tc>
           <w:tcPr>
             <w:tcW w:w="2100" w:type="dxa"/>
@@ -3615,6 +3562,7 @@
                 <w:sz w:val="20"/>
                 <w:szCs w:val="20"/>
               </w:rPr>
+              <w:lastRenderedPageBreak/>
               <w:t>quiz_attempts</w:t>
             </w:r>
             <w:proofErr w:type="spellEnd"/>
@@ -3700,12 +3648,6 @@
         </w:tc>
       </w:tr>
       <w:tr>
-        <w:tblPrEx>
-          <w:tblCellMar>
-            <w:top w:w="0" w:type="dxa"/>
-            <w:bottom w:w="0" w:type="dxa"/>
-          </w:tblCellMar>
-        </w:tblPrEx>
         <w:tc>
           <w:tcPr>
             <w:tcW w:w="2100" w:type="dxa"/>
@@ -3824,12 +3766,6 @@
         </w:tc>
       </w:tr>
       <w:tr>
-        <w:tblPrEx>
-          <w:tblCellMar>
-            <w:top w:w="0" w:type="dxa"/>
-            <w:bottom w:w="0" w:type="dxa"/>
-          </w:tblCellMar>
-        </w:tblPrEx>
         <w:tc>
           <w:tcPr>
             <w:tcW w:w="2100" w:type="dxa"/>
@@ -3935,12 +3871,6 @@
         <w:gridCol w:w="6026"/>
       </w:tblGrid>
       <w:tr>
-        <w:tblPrEx>
-          <w:tblCellMar>
-            <w:top w:w="0" w:type="dxa"/>
-            <w:bottom w:w="0" w:type="dxa"/>
-          </w:tblCellMar>
-        </w:tblPrEx>
         <w:trPr>
           <w:tblHeader/>
         </w:trPr>
@@ -3996,12 +3926,6 @@
         </w:tc>
       </w:tr>
       <w:tr>
-        <w:tblPrEx>
-          <w:tblCellMar>
-            <w:top w:w="0" w:type="dxa"/>
-            <w:bottom w:w="0" w:type="dxa"/>
-          </w:tblCellMar>
-        </w:tblPrEx>
         <w:tc>
           <w:tcPr>
             <w:tcW w:w="3000" w:type="dxa"/>
@@ -4048,12 +3972,6 @@
         </w:tc>
       </w:tr>
       <w:tr>
-        <w:tblPrEx>
-          <w:tblCellMar>
-            <w:top w:w="0" w:type="dxa"/>
-            <w:bottom w:w="0" w:type="dxa"/>
-          </w:tblCellMar>
-        </w:tblPrEx>
         <w:tc>
           <w:tcPr>
             <w:tcW w:w="3000" w:type="dxa"/>
@@ -4109,12 +4027,6 @@
         </w:tc>
       </w:tr>
       <w:tr>
-        <w:tblPrEx>
-          <w:tblCellMar>
-            <w:top w:w="0" w:type="dxa"/>
-            <w:bottom w:w="0" w:type="dxa"/>
-          </w:tblCellMar>
-        </w:tblPrEx>
         <w:tc>
           <w:tcPr>
             <w:tcW w:w="3000" w:type="dxa"/>
@@ -4161,12 +4073,6 @@
         </w:tc>
       </w:tr>
       <w:tr>
-        <w:tblPrEx>
-          <w:tblCellMar>
-            <w:top w:w="0" w:type="dxa"/>
-            <w:bottom w:w="0" w:type="dxa"/>
-          </w:tblCellMar>
-        </w:tblPrEx>
         <w:tc>
           <w:tcPr>
             <w:tcW w:w="3000" w:type="dxa"/>
@@ -4238,12 +4144,6 @@
         </w:tc>
       </w:tr>
       <w:tr>
-        <w:tblPrEx>
-          <w:tblCellMar>
-            <w:top w:w="0" w:type="dxa"/>
-            <w:bottom w:w="0" w:type="dxa"/>
-          </w:tblCellMar>
-        </w:tblPrEx>
         <w:tc>
           <w:tcPr>
             <w:tcW w:w="3000" w:type="dxa"/>
@@ -4315,12 +4215,6 @@
         </w:tc>
       </w:tr>
       <w:tr>
-        <w:tblPrEx>
-          <w:tblCellMar>
-            <w:top w:w="0" w:type="dxa"/>
-            <w:bottom w:w="0" w:type="dxa"/>
-          </w:tblCellMar>
-        </w:tblPrEx>
         <w:tc>
           <w:tcPr>
             <w:tcW w:w="3000" w:type="dxa"/>
@@ -4369,12 +4263,6 @@
         </w:tc>
       </w:tr>
       <w:tr>
-        <w:tblPrEx>
-          <w:tblCellMar>
-            <w:top w:w="0" w:type="dxa"/>
-            <w:bottom w:w="0" w:type="dxa"/>
-          </w:tblCellMar>
-        </w:tblPrEx>
         <w:tc>
           <w:tcPr>
             <w:tcW w:w="3000" w:type="dxa"/>
@@ -4423,12 +4311,6 @@
         </w:tc>
       </w:tr>
       <w:tr>
-        <w:tblPrEx>
-          <w:tblCellMar>
-            <w:top w:w="0" w:type="dxa"/>
-            <w:bottom w:w="0" w:type="dxa"/>
-          </w:tblCellMar>
-        </w:tblPrEx>
         <w:tc>
           <w:tcPr>
             <w:tcW w:w="3000" w:type="dxa"/>
@@ -4477,12 +4359,6 @@
         </w:tc>
       </w:tr>
       <w:tr>
-        <w:tblPrEx>
-          <w:tblCellMar>
-            <w:top w:w="0" w:type="dxa"/>
-            <w:bottom w:w="0" w:type="dxa"/>
-          </w:tblCellMar>
-        </w:tblPrEx>
         <w:tc>
           <w:tcPr>
             <w:tcW w:w="3000" w:type="dxa"/>
@@ -4531,12 +4407,6 @@
         </w:tc>
       </w:tr>
       <w:tr>
-        <w:tblPrEx>
-          <w:tblCellMar>
-            <w:top w:w="0" w:type="dxa"/>
-            <w:bottom w:w="0" w:type="dxa"/>
-          </w:tblCellMar>
-        </w:tblPrEx>
         <w:tc>
           <w:tcPr>
             <w:tcW w:w="3000" w:type="dxa"/>
@@ -4585,12 +4455,6 @@
         </w:tc>
       </w:tr>
       <w:tr>
-        <w:tblPrEx>
-          <w:tblCellMar>
-            <w:top w:w="0" w:type="dxa"/>
-            <w:bottom w:w="0" w:type="dxa"/>
-          </w:tblCellMar>
-        </w:tblPrEx>
         <w:tc>
           <w:tcPr>
             <w:tcW w:w="3000" w:type="dxa"/>
@@ -4662,12 +4526,6 @@
         </w:tc>
       </w:tr>
       <w:tr>
-        <w:tblPrEx>
-          <w:tblCellMar>
-            <w:top w:w="0" w:type="dxa"/>
-            <w:bottom w:w="0" w:type="dxa"/>
-          </w:tblCellMar>
-        </w:tblPrEx>
         <w:tc>
           <w:tcPr>
             <w:tcW w:w="3000" w:type="dxa"/>
@@ -4788,17 +4646,11 @@
       </w:r>
     </w:p>
     <w:p>
-      <w:r>
-        <w:br w:type="page"/>
-      </w:r>
-    </w:p>
-    <w:p>
       <w:pPr>
         <w:pStyle w:val="Heading1"/>
       </w:pPr>
       <w:bookmarkStart w:id="13" w:name="_Toc233839619"/>
       <w:r>
-        <w:lastRenderedPageBreak/>
         <w:t>3. Implementation</w:t>
       </w:r>
       <w:bookmarkEnd w:id="13"/>
@@ -4827,6 +4679,7 @@
         <w:rPr>
           <w:noProof/>
         </w:rPr>
+        <w:lastRenderedPageBreak/>
         <w:drawing>
           <wp:inline distT="0" distB="0" distL="0" distR="0" wp14:anchorId="08183FF1" wp14:editId="2559C2F0">
             <wp:extent cx="3868769" cy="2607425"/>
@@ -5024,7 +4877,6 @@
         <w:jc w:val="both"/>
       </w:pPr>
       <w:r>
-        <w:lastRenderedPageBreak/>
         <w:t xml:space="preserve">A dedicated panel presents an overview of dashboard items, exam grades, and a performance </w:t>
       </w:r>
       <w:proofErr w:type="gramStart"/>
@@ -5057,6 +4909,7 @@
         <w:jc w:val="both"/>
       </w:pPr>
       <w:r>
+        <w:lastRenderedPageBreak/>
         <w:t xml:space="preserve">The settings screen centralizes profile access, notification preferences, language selection, and sign-out. The app ships with full Arabic (default) and English localization via </w:t>
       </w:r>
       <w:proofErr w:type="spellStart"/>
@@ -5427,12 +5280,6 @@
         <w:gridCol w:w="6318"/>
       </w:tblGrid>
       <w:tr>
-        <w:tblPrEx>
-          <w:tblCellMar>
-            <w:top w:w="0" w:type="dxa"/>
-            <w:bottom w:w="0" w:type="dxa"/>
-          </w:tblCellMar>
-        </w:tblPrEx>
         <w:trPr>
           <w:tblHeader/>
         </w:trPr>
@@ -5488,12 +5335,6 @@
         </w:tc>
       </w:tr>
       <w:tr>
-        <w:tblPrEx>
-          <w:tblCellMar>
-            <w:top w:w="0" w:type="dxa"/>
-            <w:bottom w:w="0" w:type="dxa"/>
-          </w:tblCellMar>
-        </w:tblPrEx>
         <w:tc>
           <w:tcPr>
             <w:tcW w:w="2708" w:type="dxa"/>
@@ -5540,12 +5381,6 @@
         </w:tc>
       </w:tr>
       <w:tr>
-        <w:tblPrEx>
-          <w:tblCellMar>
-            <w:top w:w="0" w:type="dxa"/>
-            <w:bottom w:w="0" w:type="dxa"/>
-          </w:tblCellMar>
-        </w:tblPrEx>
         <w:tc>
           <w:tcPr>
             <w:tcW w:w="2708" w:type="dxa"/>
@@ -5592,12 +5427,6 @@
         </w:tc>
       </w:tr>
       <w:tr>
-        <w:tblPrEx>
-          <w:tblCellMar>
-            <w:top w:w="0" w:type="dxa"/>
-            <w:bottom w:w="0" w:type="dxa"/>
-          </w:tblCellMar>
-        </w:tblPrEx>
         <w:tc>
           <w:tcPr>
             <w:tcW w:w="2708" w:type="dxa"/>
@@ -5644,12 +5473,6 @@
         </w:tc>
       </w:tr>
       <w:tr>
-        <w:tblPrEx>
-          <w:tblCellMar>
-            <w:top w:w="0" w:type="dxa"/>
-            <w:bottom w:w="0" w:type="dxa"/>
-          </w:tblCellMar>
-        </w:tblPrEx>
         <w:tc>
           <w:tcPr>
             <w:tcW w:w="2708" w:type="dxa"/>
@@ -5696,12 +5519,6 @@
         </w:tc>
       </w:tr>
       <w:tr>
-        <w:tblPrEx>
-          <w:tblCellMar>
-            <w:top w:w="0" w:type="dxa"/>
-            <w:bottom w:w="0" w:type="dxa"/>
-          </w:tblCellMar>
-        </w:tblPrEx>
         <w:tc>
           <w:tcPr>
             <w:tcW w:w="2708" w:type="dxa"/>
@@ -5748,12 +5565,6 @@
         </w:tc>
       </w:tr>
       <w:tr>
-        <w:tblPrEx>
-          <w:tblCellMar>
-            <w:top w:w="0" w:type="dxa"/>
-            <w:bottom w:w="0" w:type="dxa"/>
-          </w:tblCellMar>
-        </w:tblPrEx>
         <w:tc>
           <w:tcPr>
             <w:tcW w:w="2708" w:type="dxa"/>
@@ -5800,12 +5611,6 @@
         </w:tc>
       </w:tr>
       <w:tr>
-        <w:tblPrEx>
-          <w:tblCellMar>
-            <w:top w:w="0" w:type="dxa"/>
-            <w:bottom w:w="0" w:type="dxa"/>
-          </w:tblCellMar>
-        </w:tblPrEx>
         <w:tc>
           <w:tcPr>
             <w:tcW w:w="2708" w:type="dxa"/>
@@ -5857,6 +5662,11 @@
         <w:pStyle w:val="Heading2"/>
       </w:pPr>
       <w:bookmarkStart w:id="26" w:name="_Toc233839632"/>
+    </w:p>
+    <w:p>
+      <w:pPr>
+        <w:pStyle w:val="Heading2"/>
+      </w:pPr>
       <w:proofErr w:type="gramStart"/>
       <w:r>
         <w:t>4.3  Screenshots</w:t>
@@ -5865,17 +5675,1912 @@
       <w:proofErr w:type="gramEnd"/>
     </w:p>
     <w:p>
+      <w:r>
+        <w:br w:type="page"/>
+      </w:r>
+    </w:p>
+    <w:p>
+      <w:pPr>
+        <w:pStyle w:val="Heading1"/>
+      </w:pPr>
+      <w:bookmarkStart w:id="27" w:name="_Toc233839633"/>
+      <w:r>
+        <w:rPr>
+          <w:noProof/>
+        </w:rPr>
+        <w:lastRenderedPageBreak/>
+        <w:drawing>
+          <wp:inline distT="0" distB="0" distL="0" distR="0" wp14:anchorId="0AD77756" wp14:editId="7D641ABF">
+            <wp:extent cx="1364343" cy="2895600"/>
+            <wp:effectExtent l="0" t="0" r="7620" b="0"/>
+            <wp:docPr id="526864025" name="Picture 32"/>
+            <wp:cNvGraphicFramePr>
+              <a:graphicFrameLocks xmlns:a="http://schemas.openxmlformats.org/drawingml/2006/main" noChangeAspect="1"/>
+            </wp:cNvGraphicFramePr>
+            <a:graphic xmlns:a="http://schemas.openxmlformats.org/drawingml/2006/main">
+              <a:graphicData uri="http://schemas.openxmlformats.org/drawingml/2006/picture">
+                <pic:pic xmlns:pic="http://schemas.openxmlformats.org/drawingml/2006/picture">
+                  <pic:nvPicPr>
+                    <pic:cNvPr id="0" name="Picture 32"/>
+                    <pic:cNvPicPr>
+                      <a:picLocks noChangeAspect="1" noChangeArrowheads="1"/>
+                    </pic:cNvPicPr>
+                  </pic:nvPicPr>
+                  <pic:blipFill>
+                    <a:blip r:embed="rId10" cstate="print">
+                      <a:extLst>
+                        <a:ext uri="{28A0092B-C50C-407E-A947-70E740481C1C}">
+                          <a14:useLocalDpi xmlns:a14="http://schemas.microsoft.com/office/drawing/2010/main" val="0"/>
+                        </a:ext>
+                      </a:extLst>
+                    </a:blip>
+                    <a:srcRect/>
+                    <a:stretch>
+                      <a:fillRect/>
+                    </a:stretch>
+                  </pic:blipFill>
+                  <pic:spPr bwMode="auto">
+                    <a:xfrm>
+                      <a:off x="0" y="0"/>
+                      <a:ext cx="1364343" cy="2895600"/>
+                    </a:xfrm>
+                    <a:prstGeom prst="rect">
+                      <a:avLst/>
+                    </a:prstGeom>
+                    <a:noFill/>
+                    <a:ln>
+                      <a:noFill/>
+                    </a:ln>
+                  </pic:spPr>
+                </pic:pic>
+              </a:graphicData>
+            </a:graphic>
+          </wp:inline>
+        </w:drawing>
+      </w:r>
+      <w:r>
+        <w:rPr>
+          <w:noProof/>
+        </w:rPr>
+        <w:drawing>
+          <wp:inline distT="0" distB="0" distL="0" distR="0" wp14:anchorId="184E0EFF" wp14:editId="18F890B6">
+            <wp:extent cx="1343025" cy="2850357"/>
+            <wp:effectExtent l="0" t="0" r="0" b="7620"/>
+            <wp:docPr id="278346157" name="Picture 33"/>
+            <wp:cNvGraphicFramePr>
+              <a:graphicFrameLocks xmlns:a="http://schemas.openxmlformats.org/drawingml/2006/main" noChangeAspect="1"/>
+            </wp:cNvGraphicFramePr>
+            <a:graphic xmlns:a="http://schemas.openxmlformats.org/drawingml/2006/main">
+              <a:graphicData uri="http://schemas.openxmlformats.org/drawingml/2006/picture">
+                <pic:pic xmlns:pic="http://schemas.openxmlformats.org/drawingml/2006/picture">
+                  <pic:nvPicPr>
+                    <pic:cNvPr id="0" name="Picture 33"/>
+                    <pic:cNvPicPr>
+                      <a:picLocks noChangeAspect="1" noChangeArrowheads="1"/>
+                    </pic:cNvPicPr>
+                  </pic:nvPicPr>
+                  <pic:blipFill>
+                    <a:blip r:embed="rId11" cstate="print">
+                      <a:extLst>
+                        <a:ext uri="{28A0092B-C50C-407E-A947-70E740481C1C}">
+                          <a14:useLocalDpi xmlns:a14="http://schemas.microsoft.com/office/drawing/2010/main" val="0"/>
+                        </a:ext>
+                      </a:extLst>
+                    </a:blip>
+                    <a:srcRect/>
+                    <a:stretch>
+                      <a:fillRect/>
+                    </a:stretch>
+                  </pic:blipFill>
+                  <pic:spPr bwMode="auto">
+                    <a:xfrm flipH="1">
+                      <a:off x="0" y="0"/>
+                      <a:ext cx="1367671" cy="2902664"/>
+                    </a:xfrm>
+                    <a:prstGeom prst="rect">
+                      <a:avLst/>
+                    </a:prstGeom>
+                    <a:noFill/>
+                    <a:ln>
+                      <a:noFill/>
+                    </a:ln>
+                  </pic:spPr>
+                </pic:pic>
+              </a:graphicData>
+            </a:graphic>
+          </wp:inline>
+        </w:drawing>
+      </w:r>
+      <w:r>
+        <w:rPr>
+          <w:noProof/>
+        </w:rPr>
+        <w:drawing>
+          <wp:inline distT="0" distB="0" distL="0" distR="0" wp14:anchorId="6B518F6F" wp14:editId="0ACA9666">
+            <wp:extent cx="1352550" cy="2870572"/>
+            <wp:effectExtent l="0" t="0" r="0" b="6350"/>
+            <wp:docPr id="1398169854" name="Picture 34"/>
+            <wp:cNvGraphicFramePr>
+              <a:graphicFrameLocks xmlns:a="http://schemas.openxmlformats.org/drawingml/2006/main" noChangeAspect="1"/>
+            </wp:cNvGraphicFramePr>
+            <a:graphic xmlns:a="http://schemas.openxmlformats.org/drawingml/2006/main">
+              <a:graphicData uri="http://schemas.openxmlformats.org/drawingml/2006/picture">
+                <pic:pic xmlns:pic="http://schemas.openxmlformats.org/drawingml/2006/picture">
+                  <pic:nvPicPr>
+                    <pic:cNvPr id="0" name="Picture 34"/>
+                    <pic:cNvPicPr>
+                      <a:picLocks noChangeAspect="1" noChangeArrowheads="1"/>
+                    </pic:cNvPicPr>
+                  </pic:nvPicPr>
+                  <pic:blipFill>
+                    <a:blip r:embed="rId12" cstate="print">
+                      <a:extLst>
+                        <a:ext uri="{28A0092B-C50C-407E-A947-70E740481C1C}">
+                          <a14:useLocalDpi xmlns:a14="http://schemas.microsoft.com/office/drawing/2010/main" val="0"/>
+                        </a:ext>
+                      </a:extLst>
+                    </a:blip>
+                    <a:srcRect/>
+                    <a:stretch>
+                      <a:fillRect/>
+                    </a:stretch>
+                  </pic:blipFill>
+                  <pic:spPr bwMode="auto">
+                    <a:xfrm>
+                      <a:off x="0" y="0"/>
+                      <a:ext cx="1363110" cy="2892984"/>
+                    </a:xfrm>
+                    <a:prstGeom prst="rect">
+                      <a:avLst/>
+                    </a:prstGeom>
+                    <a:noFill/>
+                    <a:ln>
+                      <a:noFill/>
+                    </a:ln>
+                  </pic:spPr>
+                </pic:pic>
+              </a:graphicData>
+            </a:graphic>
+          </wp:inline>
+        </w:drawing>
+      </w:r>
+      <w:r>
+        <w:rPr>
+          <w:noProof/>
+        </w:rPr>
+        <w:drawing>
+          <wp:inline distT="0" distB="0" distL="0" distR="0" wp14:anchorId="5699162C" wp14:editId="7D5A4308">
+            <wp:extent cx="1355367" cy="2876550"/>
+            <wp:effectExtent l="0" t="0" r="0" b="0"/>
+            <wp:docPr id="1631850460" name="Picture 35"/>
+            <wp:cNvGraphicFramePr>
+              <a:graphicFrameLocks xmlns:a="http://schemas.openxmlformats.org/drawingml/2006/main" noChangeAspect="1"/>
+            </wp:cNvGraphicFramePr>
+            <a:graphic xmlns:a="http://schemas.openxmlformats.org/drawingml/2006/main">
+              <a:graphicData uri="http://schemas.openxmlformats.org/drawingml/2006/picture">
+                <pic:pic xmlns:pic="http://schemas.openxmlformats.org/drawingml/2006/picture">
+                  <pic:nvPicPr>
+                    <pic:cNvPr id="0" name="Picture 35"/>
+                    <pic:cNvPicPr>
+                      <a:picLocks noChangeAspect="1" noChangeArrowheads="1"/>
+                    </pic:cNvPicPr>
+                  </pic:nvPicPr>
+                  <pic:blipFill>
+                    <a:blip r:embed="rId13" cstate="print">
+                      <a:extLst>
+                        <a:ext uri="{28A0092B-C50C-407E-A947-70E740481C1C}">
+                          <a14:useLocalDpi xmlns:a14="http://schemas.microsoft.com/office/drawing/2010/main" val="0"/>
+                        </a:ext>
+                      </a:extLst>
+                    </a:blip>
+                    <a:srcRect/>
+                    <a:stretch>
+                      <a:fillRect/>
+                    </a:stretch>
+                  </pic:blipFill>
+                  <pic:spPr bwMode="auto">
+                    <a:xfrm>
+                      <a:off x="0" y="0"/>
+                      <a:ext cx="1377868" cy="2924304"/>
+                    </a:xfrm>
+                    <a:prstGeom prst="rect">
+                      <a:avLst/>
+                    </a:prstGeom>
+                    <a:noFill/>
+                    <a:ln>
+                      <a:noFill/>
+                    </a:ln>
+                  </pic:spPr>
+                </pic:pic>
+              </a:graphicData>
+            </a:graphic>
+          </wp:inline>
+        </w:drawing>
+      </w:r>
+      <w:r>
+        <w:rPr>
+          <w:noProof/>
+        </w:rPr>
+        <w:drawing>
+          <wp:inline distT="0" distB="0" distL="0" distR="0" wp14:anchorId="343744B0" wp14:editId="6F67D4C4">
+            <wp:extent cx="1454102" cy="3086100"/>
+            <wp:effectExtent l="0" t="0" r="0" b="0"/>
+            <wp:docPr id="2086693636" name="Picture 36"/>
+            <wp:cNvGraphicFramePr>
+              <a:graphicFrameLocks xmlns:a="http://schemas.openxmlformats.org/drawingml/2006/main" noChangeAspect="1"/>
+            </wp:cNvGraphicFramePr>
+            <a:graphic xmlns:a="http://schemas.openxmlformats.org/drawingml/2006/main">
+              <a:graphicData uri="http://schemas.openxmlformats.org/drawingml/2006/picture">
+                <pic:pic xmlns:pic="http://schemas.openxmlformats.org/drawingml/2006/picture">
+                  <pic:nvPicPr>
+                    <pic:cNvPr id="0" name="Picture 36"/>
+                    <pic:cNvPicPr>
+                      <a:picLocks noChangeAspect="1" noChangeArrowheads="1"/>
+                    </pic:cNvPicPr>
+                  </pic:nvPicPr>
+                  <pic:blipFill>
+                    <a:blip r:embed="rId14" cstate="print">
+                      <a:extLst>
+                        <a:ext uri="{28A0092B-C50C-407E-A947-70E740481C1C}">
+                          <a14:useLocalDpi xmlns:a14="http://schemas.microsoft.com/office/drawing/2010/main" val="0"/>
+                        </a:ext>
+                      </a:extLst>
+                    </a:blip>
+                    <a:srcRect/>
+                    <a:stretch>
+                      <a:fillRect/>
+                    </a:stretch>
+                  </pic:blipFill>
+                  <pic:spPr bwMode="auto">
+                    <a:xfrm>
+                      <a:off x="0" y="0"/>
+                      <a:ext cx="1459886" cy="3098376"/>
+                    </a:xfrm>
+                    <a:prstGeom prst="rect">
+                      <a:avLst/>
+                    </a:prstGeom>
+                    <a:noFill/>
+                    <a:ln>
+                      <a:noFill/>
+                    </a:ln>
+                  </pic:spPr>
+                </pic:pic>
+              </a:graphicData>
+            </a:graphic>
+          </wp:inline>
+        </w:drawing>
+      </w:r>
+      <w:r>
+        <w:rPr>
+          <w:noProof/>
+        </w:rPr>
+        <w:drawing>
+          <wp:inline distT="0" distB="0" distL="0" distR="0" wp14:anchorId="5ACE20F4" wp14:editId="1CF49E41">
+            <wp:extent cx="1449614" cy="3076575"/>
+            <wp:effectExtent l="0" t="0" r="0" b="0"/>
+            <wp:docPr id="537725586" name="Picture 38"/>
+            <wp:cNvGraphicFramePr>
+              <a:graphicFrameLocks xmlns:a="http://schemas.openxmlformats.org/drawingml/2006/main" noChangeAspect="1"/>
+            </wp:cNvGraphicFramePr>
+            <a:graphic xmlns:a="http://schemas.openxmlformats.org/drawingml/2006/main">
+              <a:graphicData uri="http://schemas.openxmlformats.org/drawingml/2006/picture">
+                <pic:pic xmlns:pic="http://schemas.openxmlformats.org/drawingml/2006/picture">
+                  <pic:nvPicPr>
+                    <pic:cNvPr id="0" name="Picture 38"/>
+                    <pic:cNvPicPr>
+                      <a:picLocks noChangeAspect="1" noChangeArrowheads="1"/>
+                    </pic:cNvPicPr>
+                  </pic:nvPicPr>
+                  <pic:blipFill>
+                    <a:blip r:embed="rId15" cstate="print">
+                      <a:extLst>
+                        <a:ext uri="{28A0092B-C50C-407E-A947-70E740481C1C}">
+                          <a14:useLocalDpi xmlns:a14="http://schemas.microsoft.com/office/drawing/2010/main" val="0"/>
+                        </a:ext>
+                      </a:extLst>
+                    </a:blip>
+                    <a:srcRect/>
+                    <a:stretch>
+                      <a:fillRect/>
+                    </a:stretch>
+                  </pic:blipFill>
+                  <pic:spPr bwMode="auto">
+                    <a:xfrm flipH="1">
+                      <a:off x="0" y="0"/>
+                      <a:ext cx="1463424" cy="3105885"/>
+                    </a:xfrm>
+                    <a:prstGeom prst="rect">
+                      <a:avLst/>
+                    </a:prstGeom>
+                    <a:noFill/>
+                    <a:ln>
+                      <a:noFill/>
+                    </a:ln>
+                  </pic:spPr>
+                </pic:pic>
+              </a:graphicData>
+            </a:graphic>
+          </wp:inline>
+        </w:drawing>
+      </w:r>
+      <w:r>
+        <w:rPr>
+          <w:noProof/>
+        </w:rPr>
+        <w:drawing>
+          <wp:inline distT="0" distB="0" distL="0" distR="0" wp14:anchorId="609EF649" wp14:editId="496E064D">
+            <wp:extent cx="1404735" cy="2981325"/>
+            <wp:effectExtent l="0" t="0" r="5080" b="0"/>
+            <wp:docPr id="2001798521" name="Picture 39"/>
+            <wp:cNvGraphicFramePr>
+              <a:graphicFrameLocks xmlns:a="http://schemas.openxmlformats.org/drawingml/2006/main" noChangeAspect="1"/>
+            </wp:cNvGraphicFramePr>
+            <a:graphic xmlns:a="http://schemas.openxmlformats.org/drawingml/2006/main">
+              <a:graphicData uri="http://schemas.openxmlformats.org/drawingml/2006/picture">
+                <pic:pic xmlns:pic="http://schemas.openxmlformats.org/drawingml/2006/picture">
+                  <pic:nvPicPr>
+                    <pic:cNvPr id="0" name="Picture 39"/>
+                    <pic:cNvPicPr>
+                      <a:picLocks noChangeAspect="1" noChangeArrowheads="1"/>
+                    </pic:cNvPicPr>
+                  </pic:nvPicPr>
+                  <pic:blipFill>
+                    <a:blip r:embed="rId16" cstate="print">
+                      <a:extLst>
+                        <a:ext uri="{28A0092B-C50C-407E-A947-70E740481C1C}">
+                          <a14:useLocalDpi xmlns:a14="http://schemas.microsoft.com/office/drawing/2010/main" val="0"/>
+                        </a:ext>
+                      </a:extLst>
+                    </a:blip>
+                    <a:srcRect/>
+                    <a:stretch>
+                      <a:fillRect/>
+                    </a:stretch>
+                  </pic:blipFill>
+                  <pic:spPr bwMode="auto">
+                    <a:xfrm>
+                      <a:off x="0" y="0"/>
+                      <a:ext cx="1419229" cy="3012087"/>
+                    </a:xfrm>
+                    <a:prstGeom prst="rect">
+                      <a:avLst/>
+                    </a:prstGeom>
+                    <a:noFill/>
+                    <a:ln>
+                      <a:noFill/>
+                    </a:ln>
+                  </pic:spPr>
+                </pic:pic>
+              </a:graphicData>
+            </a:graphic>
+          </wp:inline>
+        </w:drawing>
+      </w:r>
+      <w:r>
+        <w:rPr>
+          <w:noProof/>
+        </w:rPr>
+        <w:drawing>
+          <wp:inline distT="0" distB="0" distL="0" distR="0" wp14:anchorId="364969FA" wp14:editId="62253BA5">
+            <wp:extent cx="1297023" cy="2752725"/>
+            <wp:effectExtent l="0" t="0" r="0" b="0"/>
+            <wp:docPr id="1982232412" name="Picture 37"/>
+            <wp:cNvGraphicFramePr>
+              <a:graphicFrameLocks xmlns:a="http://schemas.openxmlformats.org/drawingml/2006/main" noChangeAspect="1"/>
+            </wp:cNvGraphicFramePr>
+            <a:graphic xmlns:a="http://schemas.openxmlformats.org/drawingml/2006/main">
+              <a:graphicData uri="http://schemas.openxmlformats.org/drawingml/2006/picture">
+                <pic:pic xmlns:pic="http://schemas.openxmlformats.org/drawingml/2006/picture">
+                  <pic:nvPicPr>
+                    <pic:cNvPr id="0" name="Picture 37"/>
+                    <pic:cNvPicPr>
+                      <a:picLocks noChangeAspect="1" noChangeArrowheads="1"/>
+                    </pic:cNvPicPr>
+                  </pic:nvPicPr>
+                  <pic:blipFill>
+                    <a:blip r:embed="rId17" cstate="print">
+                      <a:extLst>
+                        <a:ext uri="{28A0092B-C50C-407E-A947-70E740481C1C}">
+                          <a14:useLocalDpi xmlns:a14="http://schemas.microsoft.com/office/drawing/2010/main" val="0"/>
+                        </a:ext>
+                      </a:extLst>
+                    </a:blip>
+                    <a:srcRect/>
+                    <a:stretch>
+                      <a:fillRect/>
+                    </a:stretch>
+                  </pic:blipFill>
+                  <pic:spPr bwMode="auto">
+                    <a:xfrm>
+                      <a:off x="0" y="0"/>
+                      <a:ext cx="1308989" cy="2778121"/>
+                    </a:xfrm>
+                    <a:prstGeom prst="rect">
+                      <a:avLst/>
+                    </a:prstGeom>
+                    <a:noFill/>
+                    <a:ln>
+                      <a:noFill/>
+                    </a:ln>
+                  </pic:spPr>
+                </pic:pic>
+              </a:graphicData>
+            </a:graphic>
+          </wp:inline>
+        </w:drawing>
+      </w:r>
+      <w:r>
+        <w:rPr>
+          <w:noProof/>
+        </w:rPr>
+        <w:lastRenderedPageBreak/>
+        <w:drawing>
+          <wp:inline distT="0" distB="0" distL="0" distR="0" wp14:anchorId="77278A38" wp14:editId="446141C7">
+            <wp:extent cx="1386784" cy="2943225"/>
+            <wp:effectExtent l="0" t="0" r="4445" b="0"/>
+            <wp:docPr id="1235557590" name="Picture 40"/>
+            <wp:cNvGraphicFramePr>
+              <a:graphicFrameLocks xmlns:a="http://schemas.openxmlformats.org/drawingml/2006/main" noChangeAspect="1"/>
+            </wp:cNvGraphicFramePr>
+            <a:graphic xmlns:a="http://schemas.openxmlformats.org/drawingml/2006/main">
+              <a:graphicData uri="http://schemas.openxmlformats.org/drawingml/2006/picture">
+                <pic:pic xmlns:pic="http://schemas.openxmlformats.org/drawingml/2006/picture">
+                  <pic:nvPicPr>
+                    <pic:cNvPr id="0" name="Picture 40"/>
+                    <pic:cNvPicPr>
+                      <a:picLocks noChangeAspect="1" noChangeArrowheads="1"/>
+                    </pic:cNvPicPr>
+                  </pic:nvPicPr>
+                  <pic:blipFill>
+                    <a:blip r:embed="rId18" cstate="print">
+                      <a:extLst>
+                        <a:ext uri="{28A0092B-C50C-407E-A947-70E740481C1C}">
+                          <a14:useLocalDpi xmlns:a14="http://schemas.microsoft.com/office/drawing/2010/main" val="0"/>
+                        </a:ext>
+                      </a:extLst>
+                    </a:blip>
+                    <a:srcRect/>
+                    <a:stretch>
+                      <a:fillRect/>
+                    </a:stretch>
+                  </pic:blipFill>
+                  <pic:spPr bwMode="auto">
+                    <a:xfrm>
+                      <a:off x="0" y="0"/>
+                      <a:ext cx="1403365" cy="2978415"/>
+                    </a:xfrm>
+                    <a:prstGeom prst="rect">
+                      <a:avLst/>
+                    </a:prstGeom>
+                    <a:noFill/>
+                    <a:ln>
+                      <a:noFill/>
+                    </a:ln>
+                  </pic:spPr>
+                </pic:pic>
+              </a:graphicData>
+            </a:graphic>
+          </wp:inline>
+        </w:drawing>
+      </w:r>
+      <w:r>
+        <w:rPr>
+          <w:noProof/>
+        </w:rPr>
+        <w:drawing>
+          <wp:inline distT="0" distB="0" distL="0" distR="0" wp14:anchorId="77AC90C7" wp14:editId="54CFD668">
+            <wp:extent cx="1404735" cy="2981325"/>
+            <wp:effectExtent l="0" t="0" r="5080" b="0"/>
+            <wp:docPr id="663272346" name="Picture 31"/>
+            <wp:cNvGraphicFramePr>
+              <a:graphicFrameLocks xmlns:a="http://schemas.openxmlformats.org/drawingml/2006/main" noChangeAspect="1"/>
+            </wp:cNvGraphicFramePr>
+            <a:graphic xmlns:a="http://schemas.openxmlformats.org/drawingml/2006/main">
+              <a:graphicData uri="http://schemas.openxmlformats.org/drawingml/2006/picture">
+                <pic:pic xmlns:pic="http://schemas.openxmlformats.org/drawingml/2006/picture">
+                  <pic:nvPicPr>
+                    <pic:cNvPr id="0" name="Picture 31"/>
+                    <pic:cNvPicPr>
+                      <a:picLocks noChangeAspect="1" noChangeArrowheads="1"/>
+                    </pic:cNvPicPr>
+                  </pic:nvPicPr>
+                  <pic:blipFill>
+                    <a:blip r:embed="rId19" cstate="print">
+                      <a:extLst>
+                        <a:ext uri="{28A0092B-C50C-407E-A947-70E740481C1C}">
+                          <a14:useLocalDpi xmlns:a14="http://schemas.microsoft.com/office/drawing/2010/main" val="0"/>
+                        </a:ext>
+                      </a:extLst>
+                    </a:blip>
+                    <a:srcRect/>
+                    <a:stretch>
+                      <a:fillRect/>
+                    </a:stretch>
+                  </pic:blipFill>
+                  <pic:spPr bwMode="auto">
+                    <a:xfrm>
+                      <a:off x="0" y="0"/>
+                      <a:ext cx="1415033" cy="3003181"/>
+                    </a:xfrm>
+                    <a:prstGeom prst="rect">
+                      <a:avLst/>
+                    </a:prstGeom>
+                    <a:noFill/>
+                    <a:ln>
+                      <a:noFill/>
+                    </a:ln>
+                  </pic:spPr>
+                </pic:pic>
+              </a:graphicData>
+            </a:graphic>
+          </wp:inline>
+        </w:drawing>
+      </w:r>
+      <w:r>
+        <w:rPr>
+          <w:noProof/>
+        </w:rPr>
+        <w:drawing>
+          <wp:inline distT="0" distB="0" distL="0" distR="0" wp14:anchorId="1E7C9BBF" wp14:editId="5AB7B60C">
+            <wp:extent cx="1391271" cy="2952750"/>
+            <wp:effectExtent l="0" t="0" r="0" b="0"/>
+            <wp:docPr id="1589585058" name="Picture 42"/>
+            <wp:cNvGraphicFramePr>
+              <a:graphicFrameLocks xmlns:a="http://schemas.openxmlformats.org/drawingml/2006/main" noChangeAspect="1"/>
+            </wp:cNvGraphicFramePr>
+            <a:graphic xmlns:a="http://schemas.openxmlformats.org/drawingml/2006/main">
+              <a:graphicData uri="http://schemas.openxmlformats.org/drawingml/2006/picture">
+                <pic:pic xmlns:pic="http://schemas.openxmlformats.org/drawingml/2006/picture">
+                  <pic:nvPicPr>
+                    <pic:cNvPr id="0" name="Picture 42"/>
+                    <pic:cNvPicPr>
+                      <a:picLocks noChangeAspect="1" noChangeArrowheads="1"/>
+                    </pic:cNvPicPr>
+                  </pic:nvPicPr>
+                  <pic:blipFill>
+                    <a:blip r:embed="rId20" cstate="print">
+                      <a:extLst>
+                        <a:ext uri="{28A0092B-C50C-407E-A947-70E740481C1C}">
+                          <a14:useLocalDpi xmlns:a14="http://schemas.microsoft.com/office/drawing/2010/main" val="0"/>
+                        </a:ext>
+                      </a:extLst>
+                    </a:blip>
+                    <a:srcRect/>
+                    <a:stretch>
+                      <a:fillRect/>
+                    </a:stretch>
+                  </pic:blipFill>
+                  <pic:spPr bwMode="auto">
+                    <a:xfrm>
+                      <a:off x="0" y="0"/>
+                      <a:ext cx="1402966" cy="2977571"/>
+                    </a:xfrm>
+                    <a:prstGeom prst="rect">
+                      <a:avLst/>
+                    </a:prstGeom>
+                    <a:noFill/>
+                    <a:ln>
+                      <a:noFill/>
+                    </a:ln>
+                  </pic:spPr>
+                </pic:pic>
+              </a:graphicData>
+            </a:graphic>
+          </wp:inline>
+        </w:drawing>
+      </w:r>
+      <w:r>
+        <w:rPr>
+          <w:noProof/>
+        </w:rPr>
+        <w:drawing>
+          <wp:inline distT="0" distB="0" distL="0" distR="0" wp14:anchorId="6DC5BB9E" wp14:editId="01DEC852">
+            <wp:extent cx="1400175" cy="2971648"/>
+            <wp:effectExtent l="0" t="0" r="0" b="635"/>
+            <wp:docPr id="23148472" name="Picture 30"/>
+            <wp:cNvGraphicFramePr>
+              <a:graphicFrameLocks xmlns:a="http://schemas.openxmlformats.org/drawingml/2006/main" noChangeAspect="1"/>
+            </wp:cNvGraphicFramePr>
+            <a:graphic xmlns:a="http://schemas.openxmlformats.org/drawingml/2006/main">
+              <a:graphicData uri="http://schemas.openxmlformats.org/drawingml/2006/picture">
+                <pic:pic xmlns:pic="http://schemas.openxmlformats.org/drawingml/2006/picture">
+                  <pic:nvPicPr>
+                    <pic:cNvPr id="0" name="Picture 30"/>
+                    <pic:cNvPicPr>
+                      <a:picLocks noChangeAspect="1" noChangeArrowheads="1"/>
+                    </pic:cNvPicPr>
+                  </pic:nvPicPr>
+                  <pic:blipFill>
+                    <a:blip r:embed="rId21" cstate="print">
+                      <a:extLst>
+                        <a:ext uri="{28A0092B-C50C-407E-A947-70E740481C1C}">
+                          <a14:useLocalDpi xmlns:a14="http://schemas.microsoft.com/office/drawing/2010/main" val="0"/>
+                        </a:ext>
+                      </a:extLst>
+                    </a:blip>
+                    <a:srcRect/>
+                    <a:stretch>
+                      <a:fillRect/>
+                    </a:stretch>
+                  </pic:blipFill>
+                  <pic:spPr bwMode="auto">
+                    <a:xfrm>
+                      <a:off x="0" y="0"/>
+                      <a:ext cx="1402832" cy="2977288"/>
+                    </a:xfrm>
+                    <a:prstGeom prst="rect">
+                      <a:avLst/>
+                    </a:prstGeom>
+                    <a:noFill/>
+                    <a:ln>
+                      <a:noFill/>
+                    </a:ln>
+                  </pic:spPr>
+                </pic:pic>
+              </a:graphicData>
+            </a:graphic>
+          </wp:inline>
+        </w:drawing>
+      </w:r>
+      <w:r>
+        <w:rPr>
+          <w:noProof/>
+        </w:rPr>
+        <w:drawing>
+          <wp:inline distT="0" distB="0" distL="0" distR="0" wp14:anchorId="7FA44C8B" wp14:editId="0690F39F">
+            <wp:extent cx="1377807" cy="2924175"/>
+            <wp:effectExtent l="0" t="0" r="0" b="0"/>
+            <wp:docPr id="823478446" name="Picture 27"/>
+            <wp:cNvGraphicFramePr>
+              <a:graphicFrameLocks xmlns:a="http://schemas.openxmlformats.org/drawingml/2006/main" noChangeAspect="1"/>
+            </wp:cNvGraphicFramePr>
+            <a:graphic xmlns:a="http://schemas.openxmlformats.org/drawingml/2006/main">
+              <a:graphicData uri="http://schemas.openxmlformats.org/drawingml/2006/picture">
+                <pic:pic xmlns:pic="http://schemas.openxmlformats.org/drawingml/2006/picture">
+                  <pic:nvPicPr>
+                    <pic:cNvPr id="0" name="Picture 27"/>
+                    <pic:cNvPicPr>
+                      <a:picLocks noChangeAspect="1" noChangeArrowheads="1"/>
+                    </pic:cNvPicPr>
+                  </pic:nvPicPr>
+                  <pic:blipFill>
+                    <a:blip r:embed="rId22" cstate="print">
+                      <a:extLst>
+                        <a:ext uri="{28A0092B-C50C-407E-A947-70E740481C1C}">
+                          <a14:useLocalDpi xmlns:a14="http://schemas.microsoft.com/office/drawing/2010/main" val="0"/>
+                        </a:ext>
+                      </a:extLst>
+                    </a:blip>
+                    <a:srcRect/>
+                    <a:stretch>
+                      <a:fillRect/>
+                    </a:stretch>
+                  </pic:blipFill>
+                  <pic:spPr bwMode="auto">
+                    <a:xfrm>
+                      <a:off x="0" y="0"/>
+                      <a:ext cx="1384145" cy="2937627"/>
+                    </a:xfrm>
+                    <a:prstGeom prst="rect">
+                      <a:avLst/>
+                    </a:prstGeom>
+                    <a:noFill/>
+                    <a:ln>
+                      <a:noFill/>
+                    </a:ln>
+                  </pic:spPr>
+                </pic:pic>
+              </a:graphicData>
+            </a:graphic>
+          </wp:inline>
+        </w:drawing>
+      </w:r>
+      <w:r>
+        <w:drawing>
+          <wp:inline distT="0" distB="0" distL="0" distR="0" wp14:anchorId="6FC7D090" wp14:editId="3B7EB275">
+            <wp:extent cx="1362075" cy="2890786"/>
+            <wp:effectExtent l="0" t="0" r="0" b="5080"/>
+            <wp:docPr id="1853356221" name="Picture 28"/>
+            <wp:cNvGraphicFramePr>
+              <a:graphicFrameLocks xmlns:a="http://schemas.openxmlformats.org/drawingml/2006/main" noChangeAspect="1"/>
+            </wp:cNvGraphicFramePr>
+            <a:graphic xmlns:a="http://schemas.openxmlformats.org/drawingml/2006/main">
+              <a:graphicData uri="http://schemas.openxmlformats.org/drawingml/2006/picture">
+                <pic:pic xmlns:pic="http://schemas.openxmlformats.org/drawingml/2006/picture">
+                  <pic:nvPicPr>
+                    <pic:cNvPr id="0" name="Picture 28"/>
+                    <pic:cNvPicPr>
+                      <a:picLocks noChangeAspect="1" noChangeArrowheads="1"/>
+                    </pic:cNvPicPr>
+                  </pic:nvPicPr>
+                  <pic:blipFill>
+                    <a:blip r:embed="rId23" cstate="print">
+                      <a:extLst>
+                        <a:ext uri="{28A0092B-C50C-407E-A947-70E740481C1C}">
+                          <a14:useLocalDpi xmlns:a14="http://schemas.microsoft.com/office/drawing/2010/main" val="0"/>
+                        </a:ext>
+                      </a:extLst>
+                    </a:blip>
+                    <a:srcRect/>
+                    <a:stretch>
+                      <a:fillRect/>
+                    </a:stretch>
+                  </pic:blipFill>
+                  <pic:spPr bwMode="auto">
+                    <a:xfrm>
+                      <a:off x="0" y="0"/>
+                      <a:ext cx="1365312" cy="2897657"/>
+                    </a:xfrm>
+                    <a:prstGeom prst="rect">
+                      <a:avLst/>
+                    </a:prstGeom>
+                    <a:noFill/>
+                    <a:ln>
+                      <a:noFill/>
+                    </a:ln>
+                  </pic:spPr>
+                </pic:pic>
+              </a:graphicData>
+            </a:graphic>
+          </wp:inline>
+        </w:drawing>
+      </w:r>
+      <w:r>
+        <w:rPr>
+          <w:noProof/>
+        </w:rPr>
+        <w:drawing>
+          <wp:inline distT="0" distB="0" distL="0" distR="0" wp14:anchorId="1A42CAE4" wp14:editId="169DB6E8">
+            <wp:extent cx="1390650" cy="2951432"/>
+            <wp:effectExtent l="0" t="0" r="0" b="1905"/>
+            <wp:docPr id="1817614311" name="Picture 29"/>
+            <wp:cNvGraphicFramePr>
+              <a:graphicFrameLocks xmlns:a="http://schemas.openxmlformats.org/drawingml/2006/main" noChangeAspect="1"/>
+            </wp:cNvGraphicFramePr>
+            <a:graphic xmlns:a="http://schemas.openxmlformats.org/drawingml/2006/main">
+              <a:graphicData uri="http://schemas.openxmlformats.org/drawingml/2006/picture">
+                <pic:pic xmlns:pic="http://schemas.openxmlformats.org/drawingml/2006/picture">
+                  <pic:nvPicPr>
+                    <pic:cNvPr id="0" name="Picture 29"/>
+                    <pic:cNvPicPr>
+                      <a:picLocks noChangeAspect="1" noChangeArrowheads="1"/>
+                    </pic:cNvPicPr>
+                  </pic:nvPicPr>
+                  <pic:blipFill>
+                    <a:blip r:embed="rId24" cstate="print">
+                      <a:extLst>
+                        <a:ext uri="{28A0092B-C50C-407E-A947-70E740481C1C}">
+                          <a14:useLocalDpi xmlns:a14="http://schemas.microsoft.com/office/drawing/2010/main" val="0"/>
+                        </a:ext>
+                      </a:extLst>
+                    </a:blip>
+                    <a:srcRect/>
+                    <a:stretch>
+                      <a:fillRect/>
+                    </a:stretch>
+                  </pic:blipFill>
+                  <pic:spPr bwMode="auto">
+                    <a:xfrm>
+                      <a:off x="0" y="0"/>
+                      <a:ext cx="1398129" cy="2967305"/>
+                    </a:xfrm>
+                    <a:prstGeom prst="rect">
+                      <a:avLst/>
+                    </a:prstGeom>
+                    <a:noFill/>
+                    <a:ln>
+                      <a:noFill/>
+                    </a:ln>
+                  </pic:spPr>
+                </pic:pic>
+              </a:graphicData>
+            </a:graphic>
+          </wp:inline>
+        </w:drawing>
+      </w:r>
+      <w:r>
+        <w:rPr>
+          <w:noProof/>
+        </w:rPr>
+        <w:drawing>
+          <wp:inline distT="0" distB="0" distL="0" distR="0" wp14:anchorId="0709E4E5" wp14:editId="60256B99">
+            <wp:extent cx="1364343" cy="2895600"/>
+            <wp:effectExtent l="0" t="0" r="7620" b="0"/>
+            <wp:docPr id="776944607" name="Picture 41"/>
+            <wp:cNvGraphicFramePr>
+              <a:graphicFrameLocks xmlns:a="http://schemas.openxmlformats.org/drawingml/2006/main" noChangeAspect="1"/>
+            </wp:cNvGraphicFramePr>
+            <a:graphic xmlns:a="http://schemas.openxmlformats.org/drawingml/2006/main">
+              <a:graphicData uri="http://schemas.openxmlformats.org/drawingml/2006/picture">
+                <pic:pic xmlns:pic="http://schemas.openxmlformats.org/drawingml/2006/picture">
+                  <pic:nvPicPr>
+                    <pic:cNvPr id="0" name="Picture 41"/>
+                    <pic:cNvPicPr>
+                      <a:picLocks noChangeAspect="1" noChangeArrowheads="1"/>
+                    </pic:cNvPicPr>
+                  </pic:nvPicPr>
+                  <pic:blipFill>
+                    <a:blip r:embed="rId25" cstate="print">
+                      <a:extLst>
+                        <a:ext uri="{28A0092B-C50C-407E-A947-70E740481C1C}">
+                          <a14:useLocalDpi xmlns:a14="http://schemas.microsoft.com/office/drawing/2010/main" val="0"/>
+                        </a:ext>
+                      </a:extLst>
+                    </a:blip>
+                    <a:srcRect/>
+                    <a:stretch>
+                      <a:fillRect/>
+                    </a:stretch>
+                  </pic:blipFill>
+                  <pic:spPr bwMode="auto">
+                    <a:xfrm>
+                      <a:off x="0" y="0"/>
+                      <a:ext cx="1368008" cy="2903378"/>
+                    </a:xfrm>
+                    <a:prstGeom prst="rect">
+                      <a:avLst/>
+                    </a:prstGeom>
+                    <a:noFill/>
+                    <a:ln>
+                      <a:noFill/>
+                    </a:ln>
+                  </pic:spPr>
+                </pic:pic>
+              </a:graphicData>
+            </a:graphic>
+          </wp:inline>
+        </w:drawing>
+      </w:r>
+      <w:r>
+        <w:rPr>
+          <w:noProof/>
+        </w:rPr>
+        <w:lastRenderedPageBreak/>
+        <w:drawing>
+          <wp:inline distT="0" distB="0" distL="0" distR="0" wp14:anchorId="6BF409FA" wp14:editId="08C09BCB">
+            <wp:extent cx="1533525" cy="3238370"/>
+            <wp:effectExtent l="0" t="0" r="0" b="635"/>
+            <wp:docPr id="1992429744" name="Picture 43"/>
+            <wp:cNvGraphicFramePr>
+              <a:graphicFrameLocks xmlns:a="http://schemas.openxmlformats.org/drawingml/2006/main" noChangeAspect="1"/>
+            </wp:cNvGraphicFramePr>
+            <a:graphic xmlns:a="http://schemas.openxmlformats.org/drawingml/2006/main">
+              <a:graphicData uri="http://schemas.openxmlformats.org/drawingml/2006/picture">
+                <pic:pic xmlns:pic="http://schemas.openxmlformats.org/drawingml/2006/picture">
+                  <pic:nvPicPr>
+                    <pic:cNvPr id="0" name="Picture 43"/>
+                    <pic:cNvPicPr>
+                      <a:picLocks noChangeAspect="1" noChangeArrowheads="1"/>
+                    </pic:cNvPicPr>
+                  </pic:nvPicPr>
+                  <pic:blipFill>
+                    <a:blip r:embed="rId26" cstate="print">
+                      <a:extLst>
+                        <a:ext uri="{28A0092B-C50C-407E-A947-70E740481C1C}">
+                          <a14:useLocalDpi xmlns:a14="http://schemas.microsoft.com/office/drawing/2010/main" val="0"/>
+                        </a:ext>
+                      </a:extLst>
+                    </a:blip>
+                    <a:srcRect/>
+                    <a:stretch>
+                      <a:fillRect/>
+                    </a:stretch>
+                  </pic:blipFill>
+                  <pic:spPr bwMode="auto">
+                    <a:xfrm>
+                      <a:off x="0" y="0"/>
+                      <a:ext cx="1546049" cy="3264817"/>
+                    </a:xfrm>
+                    <a:prstGeom prst="rect">
+                      <a:avLst/>
+                    </a:prstGeom>
+                    <a:noFill/>
+                    <a:ln>
+                      <a:noFill/>
+                    </a:ln>
+                  </pic:spPr>
+                </pic:pic>
+              </a:graphicData>
+            </a:graphic>
+          </wp:inline>
+        </w:drawing>
+      </w:r>
+      <w:r>
+        <w:rPr>
+          <w:noProof/>
+        </w:rPr>
+        <w:drawing>
+          <wp:inline distT="0" distB="0" distL="0" distR="0" wp14:anchorId="2ABF4C69" wp14:editId="152A09A4">
+            <wp:extent cx="1534886" cy="3257550"/>
+            <wp:effectExtent l="0" t="0" r="8255" b="0"/>
+            <wp:docPr id="166555324" name="Picture 47"/>
+            <wp:cNvGraphicFramePr>
+              <a:graphicFrameLocks xmlns:a="http://schemas.openxmlformats.org/drawingml/2006/main" noChangeAspect="1"/>
+            </wp:cNvGraphicFramePr>
+            <a:graphic xmlns:a="http://schemas.openxmlformats.org/drawingml/2006/main">
+              <a:graphicData uri="http://schemas.openxmlformats.org/drawingml/2006/picture">
+                <pic:pic xmlns:pic="http://schemas.openxmlformats.org/drawingml/2006/picture">
+                  <pic:nvPicPr>
+                    <pic:cNvPr id="0" name="Picture 47"/>
+                    <pic:cNvPicPr>
+                      <a:picLocks noChangeAspect="1" noChangeArrowheads="1"/>
+                    </pic:cNvPicPr>
+                  </pic:nvPicPr>
+                  <pic:blipFill>
+                    <a:blip r:embed="rId27" cstate="print">
+                      <a:extLst>
+                        <a:ext uri="{28A0092B-C50C-407E-A947-70E740481C1C}">
+                          <a14:useLocalDpi xmlns:a14="http://schemas.microsoft.com/office/drawing/2010/main" val="0"/>
+                        </a:ext>
+                      </a:extLst>
+                    </a:blip>
+                    <a:srcRect/>
+                    <a:stretch>
+                      <a:fillRect/>
+                    </a:stretch>
+                  </pic:blipFill>
+                  <pic:spPr bwMode="auto">
+                    <a:xfrm>
+                      <a:off x="0" y="0"/>
+                      <a:ext cx="1543106" cy="3274997"/>
+                    </a:xfrm>
+                    <a:prstGeom prst="rect">
+                      <a:avLst/>
+                    </a:prstGeom>
+                    <a:noFill/>
+                    <a:ln>
+                      <a:noFill/>
+                    </a:ln>
+                  </pic:spPr>
+                </pic:pic>
+              </a:graphicData>
+            </a:graphic>
+          </wp:inline>
+        </w:drawing>
+      </w:r>
+      <w:r>
+        <w:rPr>
+          <w:noProof/>
+        </w:rPr>
+        <w:drawing>
+          <wp:inline distT="0" distB="0" distL="0" distR="0" wp14:anchorId="3640DB57" wp14:editId="07C11407">
+            <wp:extent cx="1504950" cy="3194017"/>
+            <wp:effectExtent l="0" t="0" r="0" b="6985"/>
+            <wp:docPr id="2139883197" name="Picture 44"/>
+            <wp:cNvGraphicFramePr>
+              <a:graphicFrameLocks xmlns:a="http://schemas.openxmlformats.org/drawingml/2006/main" noChangeAspect="1"/>
+            </wp:cNvGraphicFramePr>
+            <a:graphic xmlns:a="http://schemas.openxmlformats.org/drawingml/2006/main">
+              <a:graphicData uri="http://schemas.openxmlformats.org/drawingml/2006/picture">
+                <pic:pic xmlns:pic="http://schemas.openxmlformats.org/drawingml/2006/picture">
+                  <pic:nvPicPr>
+                    <pic:cNvPr id="0" name="Picture 44"/>
+                    <pic:cNvPicPr>
+                      <a:picLocks noChangeAspect="1" noChangeArrowheads="1"/>
+                    </pic:cNvPicPr>
+                  </pic:nvPicPr>
+                  <pic:blipFill>
+                    <a:blip r:embed="rId28" cstate="print">
+                      <a:extLst>
+                        <a:ext uri="{28A0092B-C50C-407E-A947-70E740481C1C}">
+                          <a14:useLocalDpi xmlns:a14="http://schemas.microsoft.com/office/drawing/2010/main" val="0"/>
+                        </a:ext>
+                      </a:extLst>
+                    </a:blip>
+                    <a:srcRect/>
+                    <a:stretch>
+                      <a:fillRect/>
+                    </a:stretch>
+                  </pic:blipFill>
+                  <pic:spPr bwMode="auto">
+                    <a:xfrm>
+                      <a:off x="0" y="0"/>
+                      <a:ext cx="1514212" cy="3213674"/>
+                    </a:xfrm>
+                    <a:prstGeom prst="rect">
+                      <a:avLst/>
+                    </a:prstGeom>
+                    <a:noFill/>
+                    <a:ln>
+                      <a:noFill/>
+                    </a:ln>
+                  </pic:spPr>
+                </pic:pic>
+              </a:graphicData>
+            </a:graphic>
+          </wp:inline>
+        </w:drawing>
+      </w:r>
+      <w:r>
+        <w:rPr>
+          <w:noProof/>
+        </w:rPr>
+        <w:drawing>
+          <wp:inline distT="0" distB="0" distL="0" distR="0" wp14:anchorId="6F5B739C" wp14:editId="452A6DBF">
+            <wp:extent cx="1543862" cy="3276600"/>
+            <wp:effectExtent l="0" t="0" r="0" b="0"/>
+            <wp:docPr id="1681687281" name="Picture 45"/>
+            <wp:cNvGraphicFramePr>
+              <a:graphicFrameLocks xmlns:a="http://schemas.openxmlformats.org/drawingml/2006/main" noChangeAspect="1"/>
+            </wp:cNvGraphicFramePr>
+            <a:graphic xmlns:a="http://schemas.openxmlformats.org/drawingml/2006/main">
+              <a:graphicData uri="http://schemas.openxmlformats.org/drawingml/2006/picture">
+                <pic:pic xmlns:pic="http://schemas.openxmlformats.org/drawingml/2006/picture">
+                  <pic:nvPicPr>
+                    <pic:cNvPr id="0" name="Picture 45"/>
+                    <pic:cNvPicPr>
+                      <a:picLocks noChangeAspect="1" noChangeArrowheads="1"/>
+                    </pic:cNvPicPr>
+                  </pic:nvPicPr>
+                  <pic:blipFill>
+                    <a:blip r:embed="rId29" cstate="print">
+                      <a:extLst>
+                        <a:ext uri="{28A0092B-C50C-407E-A947-70E740481C1C}">
+                          <a14:useLocalDpi xmlns:a14="http://schemas.microsoft.com/office/drawing/2010/main" val="0"/>
+                        </a:ext>
+                      </a:extLst>
+                    </a:blip>
+                    <a:srcRect/>
+                    <a:stretch>
+                      <a:fillRect/>
+                    </a:stretch>
+                  </pic:blipFill>
+                  <pic:spPr bwMode="auto">
+                    <a:xfrm>
+                      <a:off x="0" y="0"/>
+                      <a:ext cx="1564314" cy="3320007"/>
+                    </a:xfrm>
+                    <a:prstGeom prst="rect">
+                      <a:avLst/>
+                    </a:prstGeom>
+                    <a:noFill/>
+                    <a:ln>
+                      <a:noFill/>
+                    </a:ln>
+                  </pic:spPr>
+                </pic:pic>
+              </a:graphicData>
+            </a:graphic>
+          </wp:inline>
+        </w:drawing>
+      </w:r>
+      <w:r>
+        <w:rPr>
+          <w:noProof/>
+        </w:rPr>
+        <w:drawing>
+          <wp:inline distT="0" distB="0" distL="0" distR="0" wp14:anchorId="635FC505" wp14:editId="52B00130">
+            <wp:extent cx="1548350" cy="3286125"/>
+            <wp:effectExtent l="0" t="0" r="0" b="0"/>
+            <wp:docPr id="327699962" name="Picture 46"/>
+            <wp:cNvGraphicFramePr>
+              <a:graphicFrameLocks xmlns:a="http://schemas.openxmlformats.org/drawingml/2006/main" noChangeAspect="1"/>
+            </wp:cNvGraphicFramePr>
+            <a:graphic xmlns:a="http://schemas.openxmlformats.org/drawingml/2006/main">
+              <a:graphicData uri="http://schemas.openxmlformats.org/drawingml/2006/picture">
+                <pic:pic xmlns:pic="http://schemas.openxmlformats.org/drawingml/2006/picture">
+                  <pic:nvPicPr>
+                    <pic:cNvPr id="0" name="Picture 46"/>
+                    <pic:cNvPicPr>
+                      <a:picLocks noChangeAspect="1" noChangeArrowheads="1"/>
+                    </pic:cNvPicPr>
+                  </pic:nvPicPr>
+                  <pic:blipFill>
+                    <a:blip r:embed="rId30" cstate="print">
+                      <a:extLst>
+                        <a:ext uri="{28A0092B-C50C-407E-A947-70E740481C1C}">
+                          <a14:useLocalDpi xmlns:a14="http://schemas.microsoft.com/office/drawing/2010/main" val="0"/>
+                        </a:ext>
+                      </a:extLst>
+                    </a:blip>
+                    <a:srcRect/>
+                    <a:stretch>
+                      <a:fillRect/>
+                    </a:stretch>
+                  </pic:blipFill>
+                  <pic:spPr bwMode="auto">
+                    <a:xfrm>
+                      <a:off x="0" y="0"/>
+                      <a:ext cx="1554397" cy="3298958"/>
+                    </a:xfrm>
+                    <a:prstGeom prst="rect">
+                      <a:avLst/>
+                    </a:prstGeom>
+                    <a:noFill/>
+                    <a:ln>
+                      <a:noFill/>
+                    </a:ln>
+                  </pic:spPr>
+                </pic:pic>
+              </a:graphicData>
+            </a:graphic>
+          </wp:inline>
+        </w:drawing>
+      </w:r>
+      <w:r>
+        <w:rPr>
+          <w:noProof/>
+        </w:rPr>
+        <w:drawing>
+          <wp:inline distT="0" distB="0" distL="0" distR="0" wp14:anchorId="2EE5A80E" wp14:editId="0826C714">
+            <wp:extent cx="1543050" cy="3258486"/>
+            <wp:effectExtent l="0" t="0" r="0" b="0"/>
+            <wp:docPr id="1920777052" name="Picture 48"/>
+            <wp:cNvGraphicFramePr>
+              <a:graphicFrameLocks xmlns:a="http://schemas.openxmlformats.org/drawingml/2006/main" noChangeAspect="1"/>
+            </wp:cNvGraphicFramePr>
+            <a:graphic xmlns:a="http://schemas.openxmlformats.org/drawingml/2006/main">
+              <a:graphicData uri="http://schemas.openxmlformats.org/drawingml/2006/picture">
+                <pic:pic xmlns:pic="http://schemas.openxmlformats.org/drawingml/2006/picture">
+                  <pic:nvPicPr>
+                    <pic:cNvPr id="0" name="Picture 48"/>
+                    <pic:cNvPicPr>
+                      <a:picLocks noChangeAspect="1" noChangeArrowheads="1"/>
+                    </pic:cNvPicPr>
+                  </pic:nvPicPr>
+                  <pic:blipFill>
+                    <a:blip r:embed="rId31" cstate="print">
+                      <a:extLst>
+                        <a:ext uri="{28A0092B-C50C-407E-A947-70E740481C1C}">
+                          <a14:useLocalDpi xmlns:a14="http://schemas.microsoft.com/office/drawing/2010/main" val="0"/>
+                        </a:ext>
+                      </a:extLst>
+                    </a:blip>
+                    <a:srcRect/>
+                    <a:stretch>
+                      <a:fillRect/>
+                    </a:stretch>
+                  </pic:blipFill>
+                  <pic:spPr bwMode="auto">
+                    <a:xfrm>
+                      <a:off x="0" y="0"/>
+                      <a:ext cx="1548150" cy="3269255"/>
+                    </a:xfrm>
+                    <a:prstGeom prst="rect">
+                      <a:avLst/>
+                    </a:prstGeom>
+                    <a:noFill/>
+                    <a:ln>
+                      <a:noFill/>
+                    </a:ln>
+                  </pic:spPr>
+                </pic:pic>
+              </a:graphicData>
+            </a:graphic>
+          </wp:inline>
+        </w:drawing>
+      </w:r>
+      <w:r>
+        <w:rPr>
+          <w:noProof/>
+        </w:rPr>
+        <w:lastRenderedPageBreak/>
+        <w:drawing>
+          <wp:inline distT="0" distB="0" distL="0" distR="0" wp14:anchorId="207215B3" wp14:editId="0BBDB71F">
+            <wp:extent cx="1724025" cy="3658968"/>
+            <wp:effectExtent l="0" t="0" r="0" b="0"/>
+            <wp:docPr id="345669648" name="Picture 49"/>
+            <wp:cNvGraphicFramePr>
+              <a:graphicFrameLocks xmlns:a="http://schemas.openxmlformats.org/drawingml/2006/main" noChangeAspect="1"/>
+            </wp:cNvGraphicFramePr>
+            <a:graphic xmlns:a="http://schemas.openxmlformats.org/drawingml/2006/main">
+              <a:graphicData uri="http://schemas.openxmlformats.org/drawingml/2006/picture">
+                <pic:pic xmlns:pic="http://schemas.openxmlformats.org/drawingml/2006/picture">
+                  <pic:nvPicPr>
+                    <pic:cNvPr id="0" name="Picture 49"/>
+                    <pic:cNvPicPr>
+                      <a:picLocks noChangeAspect="1" noChangeArrowheads="1"/>
+                    </pic:cNvPicPr>
+                  </pic:nvPicPr>
+                  <pic:blipFill>
+                    <a:blip r:embed="rId32" cstate="print">
+                      <a:extLst>
+                        <a:ext uri="{28A0092B-C50C-407E-A947-70E740481C1C}">
+                          <a14:useLocalDpi xmlns:a14="http://schemas.microsoft.com/office/drawing/2010/main" val="0"/>
+                        </a:ext>
+                      </a:extLst>
+                    </a:blip>
+                    <a:srcRect/>
+                    <a:stretch>
+                      <a:fillRect/>
+                    </a:stretch>
+                  </pic:blipFill>
+                  <pic:spPr bwMode="auto">
+                    <a:xfrm>
+                      <a:off x="0" y="0"/>
+                      <a:ext cx="1728788" cy="3669076"/>
+                    </a:xfrm>
+                    <a:prstGeom prst="rect">
+                      <a:avLst/>
+                    </a:prstGeom>
+                    <a:noFill/>
+                    <a:ln>
+                      <a:noFill/>
+                    </a:ln>
+                  </pic:spPr>
+                </pic:pic>
+              </a:graphicData>
+            </a:graphic>
+          </wp:inline>
+        </w:drawing>
+      </w:r>
+      <w:r>
+        <w:rPr>
+          <w:noProof/>
+        </w:rPr>
+        <w:drawing>
+          <wp:inline distT="0" distB="0" distL="0" distR="0" wp14:anchorId="1981EF97" wp14:editId="4ADC97F0">
+            <wp:extent cx="1741332" cy="3695700"/>
+            <wp:effectExtent l="0" t="0" r="0" b="0"/>
+            <wp:docPr id="1335941575" name="Picture 50"/>
+            <wp:cNvGraphicFramePr>
+              <a:graphicFrameLocks xmlns:a="http://schemas.openxmlformats.org/drawingml/2006/main" noChangeAspect="1"/>
+            </wp:cNvGraphicFramePr>
+            <a:graphic xmlns:a="http://schemas.openxmlformats.org/drawingml/2006/main">
+              <a:graphicData uri="http://schemas.openxmlformats.org/drawingml/2006/picture">
+                <pic:pic xmlns:pic="http://schemas.openxmlformats.org/drawingml/2006/picture">
+                  <pic:nvPicPr>
+                    <pic:cNvPr id="0" name="Picture 50"/>
+                    <pic:cNvPicPr>
+                      <a:picLocks noChangeAspect="1" noChangeArrowheads="1"/>
+                    </pic:cNvPicPr>
+                  </pic:nvPicPr>
+                  <pic:blipFill>
+                    <a:blip r:embed="rId33" cstate="print">
+                      <a:extLst>
+                        <a:ext uri="{28A0092B-C50C-407E-A947-70E740481C1C}">
+                          <a14:useLocalDpi xmlns:a14="http://schemas.microsoft.com/office/drawing/2010/main" val="0"/>
+                        </a:ext>
+                      </a:extLst>
+                    </a:blip>
+                    <a:srcRect/>
+                    <a:stretch>
+                      <a:fillRect/>
+                    </a:stretch>
+                  </pic:blipFill>
+                  <pic:spPr bwMode="auto">
+                    <a:xfrm>
+                      <a:off x="0" y="0"/>
+                      <a:ext cx="1749170" cy="3712334"/>
+                    </a:xfrm>
+                    <a:prstGeom prst="rect">
+                      <a:avLst/>
+                    </a:prstGeom>
+                    <a:noFill/>
+                    <a:ln>
+                      <a:noFill/>
+                    </a:ln>
+                  </pic:spPr>
+                </pic:pic>
+              </a:graphicData>
+            </a:graphic>
+          </wp:inline>
+        </w:drawing>
+      </w:r>
+      <w:r>
+        <w:rPr>
+          <w:noProof/>
+        </w:rPr>
+        <w:drawing>
+          <wp:inline distT="0" distB="0" distL="0" distR="0" wp14:anchorId="7E94FC9F" wp14:editId="71D671E7">
+            <wp:extent cx="1723175" cy="3657164"/>
+            <wp:effectExtent l="0" t="0" r="0" b="635"/>
+            <wp:docPr id="1400135762" name="Picture 51"/>
+            <wp:cNvGraphicFramePr>
+              <a:graphicFrameLocks xmlns:a="http://schemas.openxmlformats.org/drawingml/2006/main" noChangeAspect="1"/>
+            </wp:cNvGraphicFramePr>
+            <a:graphic xmlns:a="http://schemas.openxmlformats.org/drawingml/2006/main">
+              <a:graphicData uri="http://schemas.openxmlformats.org/drawingml/2006/picture">
+                <pic:pic xmlns:pic="http://schemas.openxmlformats.org/drawingml/2006/picture">
+                  <pic:nvPicPr>
+                    <pic:cNvPr id="0" name="Picture 51"/>
+                    <pic:cNvPicPr>
+                      <a:picLocks noChangeAspect="1" noChangeArrowheads="1"/>
+                    </pic:cNvPicPr>
+                  </pic:nvPicPr>
+                  <pic:blipFill>
+                    <a:blip r:embed="rId34" cstate="print">
+                      <a:extLst>
+                        <a:ext uri="{28A0092B-C50C-407E-A947-70E740481C1C}">
+                          <a14:useLocalDpi xmlns:a14="http://schemas.microsoft.com/office/drawing/2010/main" val="0"/>
+                        </a:ext>
+                      </a:extLst>
+                    </a:blip>
+                    <a:srcRect/>
+                    <a:stretch>
+                      <a:fillRect/>
+                    </a:stretch>
+                  </pic:blipFill>
+                  <pic:spPr bwMode="auto">
+                    <a:xfrm>
+                      <a:off x="0" y="0"/>
+                      <a:ext cx="1742816" cy="3698848"/>
+                    </a:xfrm>
+                    <a:prstGeom prst="rect">
+                      <a:avLst/>
+                    </a:prstGeom>
+                    <a:noFill/>
+                    <a:ln>
+                      <a:noFill/>
+                    </a:ln>
+                  </pic:spPr>
+                </pic:pic>
+              </a:graphicData>
+            </a:graphic>
+          </wp:inline>
+        </w:drawing>
+      </w:r>
+      <w:r>
+        <w:t>5. Challenges, Limitations &amp; Future Work</w:t>
+      </w:r>
+      <w:bookmarkEnd w:id="27"/>
+    </w:p>
+    <w:p>
+      <w:pPr>
+        <w:pStyle w:val="Heading2"/>
+      </w:pPr>
+      <w:bookmarkStart w:id="28" w:name="_Toc233839634"/>
+      <w:proofErr w:type="gramStart"/>
+      <w:r>
+        <w:t>5.1  Challenges</w:t>
+      </w:r>
+      <w:proofErr w:type="gramEnd"/>
+      <w:r>
+        <w:t xml:space="preserve"> Faced</w:t>
+      </w:r>
+      <w:bookmarkEnd w:id="28"/>
+    </w:p>
+    <w:p>
+      <w:pPr>
+        <w:pStyle w:val="ListParagraph"/>
+        <w:numPr>
+          <w:ilvl w:val="0"/>
+          <w:numId w:val="2"/>
+        </w:numPr>
+        <w:spacing w:after="120" w:line="276" w:lineRule="auto"/>
+      </w:pPr>
+      <w:r>
+        <w:rPr>
+          <w:b/>
+          <w:bCs/>
+        </w:rPr>
+        <w:t xml:space="preserve">Real-time quiz timing: </w:t>
+      </w:r>
+      <w:r>
+        <w:t xml:space="preserve">Coordinating a live, per-question countdown against </w:t>
+      </w:r>
+      <w:proofErr w:type="spellStart"/>
+      <w:r>
+        <w:t>Firestore's</w:t>
+      </w:r>
+      <w:proofErr w:type="spellEnd"/>
+      <w:r>
+        <w:t xml:space="preserve"> asynchronous, stream-based data model required careful state handling in the Quiz cubits.</w:t>
+      </w:r>
+    </w:p>
+    <w:p>
+      <w:pPr>
+        <w:pStyle w:val="ListParagraph"/>
+        <w:numPr>
+          <w:ilvl w:val="0"/>
+          <w:numId w:val="2"/>
+        </w:numPr>
+        <w:spacing w:after="120" w:line="276" w:lineRule="auto"/>
+      </w:pPr>
+      <w:r>
+        <w:rPr>
+          <w:b/>
+          <w:bCs/>
+        </w:rPr>
+        <w:t xml:space="preserve">Incremental architecture migration: </w:t>
+      </w:r>
+      <w:r>
+        <w:t>Introducing Clean Architecture for the Quiz module while keeping the rest of the app on a simpler repository pattern required a clear internal convention so the two approaches stay consistent and mergeable.</w:t>
+      </w:r>
+    </w:p>
+    <w:p>
+      <w:pPr>
+        <w:pStyle w:val="ListParagraph"/>
+        <w:numPr>
+          <w:ilvl w:val="0"/>
+          <w:numId w:val="2"/>
+        </w:numPr>
+        <w:spacing w:after="120" w:line="276" w:lineRule="auto"/>
+      </w:pPr>
+      <w:r>
+        <w:rPr>
+          <w:b/>
+          <w:bCs/>
+        </w:rPr>
+        <w:t xml:space="preserve">Bilingual RTL/LTR UI: </w:t>
+      </w:r>
+      <w:r>
+        <w:t>Supporting Arabic (RTL) and English (LTR) from the same layout required consistent use of directional-aware widgets rather than hardcoded alignment.</w:t>
+      </w:r>
+    </w:p>
+    <w:p>
+      <w:pPr>
+        <w:pStyle w:val="Heading2"/>
+      </w:pPr>
+      <w:bookmarkStart w:id="29" w:name="_Toc233839635"/>
+      <w:proofErr w:type="gramStart"/>
+      <w:r>
+        <w:t>5.2  Current</w:t>
+      </w:r>
+      <w:proofErr w:type="gramEnd"/>
+      <w:r>
+        <w:t xml:space="preserve"> Limitations</w:t>
+      </w:r>
+      <w:bookmarkEnd w:id="29"/>
+    </w:p>
+    <w:p>
+      <w:pPr>
+        <w:pStyle w:val="ListParagraph"/>
+        <w:numPr>
+          <w:ilvl w:val="0"/>
+          <w:numId w:val="2"/>
+        </w:numPr>
+        <w:spacing w:after="120" w:line="276" w:lineRule="auto"/>
+      </w:pPr>
+      <w:r>
+        <w:rPr>
+          <w:b/>
+          <w:bCs/>
+        </w:rPr>
+        <w:t xml:space="preserve">Notifications &amp; storage: </w:t>
+      </w:r>
+      <w:r>
+        <w:t>Notifications and file/avatar storage are not yet implemented, even though the notifications collection and related UI placeholders already exist.</w:t>
+      </w:r>
+    </w:p>
+    <w:p>
+      <w:pPr>
+        <w:pStyle w:val="ListParagraph"/>
+        <w:numPr>
+          <w:ilvl w:val="0"/>
+          <w:numId w:val="2"/>
+        </w:numPr>
+        <w:spacing w:after="120" w:line="276" w:lineRule="auto"/>
+      </w:pPr>
+      <w:r>
+        <w:rPr>
+          <w:b/>
+          <w:bCs/>
+        </w:rPr>
+        <w:t xml:space="preserve">Incomplete settings destinations: </w:t>
+      </w:r>
+      <w:r>
+        <w:t>The Settings screen's Language, Help Center, and Privacy Policy entries are visible but not yet wired to destination screens.</w:t>
+      </w:r>
+    </w:p>
+    <w:p>
+      <w:pPr>
+        <w:pStyle w:val="ListParagraph"/>
+        <w:numPr>
+          <w:ilvl w:val="0"/>
+          <w:numId w:val="2"/>
+        </w:numPr>
+        <w:spacing w:after="120" w:line="276" w:lineRule="auto"/>
+      </w:pPr>
+      <w:r>
+        <w:rPr>
+          <w:b/>
+          <w:bCs/>
+        </w:rPr>
+        <w:t xml:space="preserve">Chat message deletion: </w:t>
+      </w:r>
+      <w:r>
+        <w:t>Deleting a chat message is defined on the repository layer but not yet implemented end-to-end.</w:t>
+      </w:r>
+    </w:p>
+    <w:p>
+      <w:pPr>
+        <w:pStyle w:val="ListParagraph"/>
+        <w:numPr>
+          <w:ilvl w:val="0"/>
+          <w:numId w:val="2"/>
+        </w:numPr>
+        <w:spacing w:after="120" w:line="276" w:lineRule="auto"/>
+      </w:pPr>
+      <w:r>
+        <w:rPr>
+          <w:b/>
+          <w:bCs/>
+        </w:rPr>
+        <w:t xml:space="preserve">No automated tests: </w:t>
+      </w:r>
+      <w:r>
+        <w:t>Automated unit/widget test coverage has not yet been added.</w:t>
+      </w:r>
+    </w:p>
+    <w:p>
+      <w:pPr>
+        <w:pStyle w:val="ListParagraph"/>
+        <w:numPr>
+          <w:ilvl w:val="0"/>
+          <w:numId w:val="2"/>
+        </w:numPr>
+        <w:spacing w:after="120" w:line="276" w:lineRule="auto"/>
+      </w:pPr>
+      <w:r>
+        <w:rPr>
+          <w:b/>
+          <w:bCs/>
+        </w:rPr>
+        <w:t xml:space="preserve">Security rules: </w:t>
+      </w:r>
+      <w:proofErr w:type="spellStart"/>
+      <w:r>
+        <w:t>Firestore</w:t>
+      </w:r>
+      <w:proofErr w:type="spellEnd"/>
+      <w:r>
+        <w:t xml:space="preserve"> Security Rules enforcing role-based access (student vs. teacher vs. admin) still need to be authored before production use.</w:t>
+      </w:r>
+    </w:p>
+    <w:p>
+      <w:pPr>
+        <w:pStyle w:val="Heading2"/>
+      </w:pPr>
+      <w:bookmarkStart w:id="30" w:name="_Toc233839636"/>
+      <w:proofErr w:type="gramStart"/>
+      <w:r>
+        <w:lastRenderedPageBreak/>
+        <w:t>5.3  Future</w:t>
+      </w:r>
+      <w:proofErr w:type="gramEnd"/>
+      <w:r>
+        <w:t xml:space="preserve"> Enhancements</w:t>
+      </w:r>
+      <w:bookmarkEnd w:id="30"/>
+    </w:p>
+    <w:p>
+      <w:pPr>
+        <w:pStyle w:val="ListParagraph"/>
+        <w:numPr>
+          <w:ilvl w:val="0"/>
+          <w:numId w:val="2"/>
+        </w:numPr>
+        <w:spacing w:after="120" w:line="276" w:lineRule="auto"/>
+      </w:pPr>
+      <w:r>
+        <w:rPr>
+          <w:b/>
+          <w:bCs/>
+        </w:rPr>
+        <w:t xml:space="preserve">Notifications: </w:t>
+      </w:r>
+      <w:r>
+        <w:t>Implement push notifications end-to-end, wired to the existing notifications collection.</w:t>
+      </w:r>
+    </w:p>
+    <w:p>
+      <w:pPr>
+        <w:pStyle w:val="ListParagraph"/>
+        <w:numPr>
+          <w:ilvl w:val="0"/>
+          <w:numId w:val="2"/>
+        </w:numPr>
+        <w:spacing w:after="120" w:line="276" w:lineRule="auto"/>
+      </w:pPr>
+      <w:r>
+        <w:rPr>
+          <w:b/>
+          <w:bCs/>
+        </w:rPr>
+        <w:t xml:space="preserve">Profile media: </w:t>
+      </w:r>
+      <w:r>
+        <w:t>Add profile avatar upload via Firebase Storage.</w:t>
+      </w:r>
+    </w:p>
+    <w:p>
+      <w:pPr>
+        <w:pStyle w:val="ListParagraph"/>
+        <w:numPr>
+          <w:ilvl w:val="0"/>
+          <w:numId w:val="2"/>
+        </w:numPr>
+        <w:spacing w:after="120" w:line="276" w:lineRule="auto"/>
+      </w:pPr>
+      <w:r>
+        <w:rPr>
+          <w:b/>
+          <w:bCs/>
+        </w:rPr>
+        <w:t xml:space="preserve">Settings completion: </w:t>
+      </w:r>
+      <w:r>
+        <w:t>Build an in-app language switcher and complete the Help Center / Privacy Policy content.</w:t>
+      </w:r>
+    </w:p>
+    <w:p>
+      <w:pPr>
+        <w:pStyle w:val="ListParagraph"/>
+        <w:numPr>
+          <w:ilvl w:val="0"/>
+          <w:numId w:val="2"/>
+        </w:numPr>
+        <w:spacing w:after="120" w:line="276" w:lineRule="auto"/>
+      </w:pPr>
+      <w:r>
+        <w:rPr>
+          <w:b/>
+          <w:bCs/>
+        </w:rPr>
+        <w:t xml:space="preserve">Architecture migration: </w:t>
+      </w:r>
+      <w:r>
+        <w:t>Migrate Authentication, User, Rooms, and Chat features to the same Clean Architecture pattern established by the Quiz module.</w:t>
+      </w:r>
+    </w:p>
+    <w:p>
+      <w:pPr>
+        <w:pStyle w:val="ListParagraph"/>
+        <w:numPr>
+          <w:ilvl w:val="0"/>
+          <w:numId w:val="2"/>
+        </w:numPr>
+        <w:spacing w:after="120" w:line="276" w:lineRule="auto"/>
+      </w:pPr>
+      <w:r>
+        <w:rPr>
+          <w:b/>
+          <w:bCs/>
+        </w:rPr>
+        <w:t xml:space="preserve">Testing: </w:t>
+      </w:r>
+      <w:r>
+        <w:t xml:space="preserve">Add unit tests </w:t>
+      </w:r>
+      <w:proofErr w:type="gramStart"/>
+      <w:r>
+        <w:t>for use</w:t>
+      </w:r>
+      <w:proofErr w:type="gramEnd"/>
+      <w:r>
+        <w:t xml:space="preserve"> cases/Cubits and widget tests for key screens.</w:t>
+      </w:r>
+    </w:p>
+    <w:p>
+      <w:pPr>
+        <w:pStyle w:val="ListParagraph"/>
+        <w:numPr>
+          <w:ilvl w:val="0"/>
+          <w:numId w:val="2"/>
+        </w:numPr>
+        <w:spacing w:after="120" w:line="276" w:lineRule="auto"/>
+      </w:pPr>
+      <w:r>
+        <w:rPr>
+          <w:b/>
+          <w:bCs/>
+        </w:rPr>
+        <w:t xml:space="preserve">Security hardening: </w:t>
+      </w:r>
+      <w:r>
+        <w:t xml:space="preserve">Author and enforce </w:t>
+      </w:r>
+      <w:proofErr w:type="spellStart"/>
+      <w:r>
+        <w:t>Firestore</w:t>
+      </w:r>
+      <w:proofErr w:type="spellEnd"/>
+      <w:r>
+        <w:t xml:space="preserve"> Security Rules ahead of any production release.</w:t>
+      </w:r>
+    </w:p>
+    <w:p>
+      <w:pPr>
+        <w:pStyle w:val="Heading1"/>
+      </w:pPr>
+      <w:bookmarkStart w:id="31" w:name="_Toc233839637"/>
+      <w:r>
+        <w:t>Conclusion</w:t>
+      </w:r>
+      <w:bookmarkEnd w:id="31"/>
+    </w:p>
+    <w:p>
       <w:pPr>
         <w:spacing w:after="200" w:line="288" w:lineRule="auto"/>
         <w:jc w:val="both"/>
       </w:pPr>
-      <w:r>
-        <w:t>Insert screenshots of the running application in the placeholders below before final submission.</w:t>
-      </w:r>
+      <w:proofErr w:type="spellStart"/>
+      <w:r>
+        <w:t>Studex</w:t>
+      </w:r>
+      <w:proofErr w:type="spellEnd"/>
+      <w:r>
+        <w:t xml:space="preserve"> demonstrates a complete, working mobile solution for collaborative studying: students can form study rooms, communicate in real time, assess themselves through quizzes, and see how they compare with peers, while teachers and admins gain visibility into performance through a monitoring dashboard. Built with Flutter and </w:t>
+      </w:r>
+      <w:proofErr w:type="gramStart"/>
+      <w:r>
+        <w:t>Firebase, and</w:t>
+      </w:r>
+      <w:proofErr w:type="gramEnd"/>
+      <w:r>
+        <w:t xml:space="preserve"> structured around the </w:t>
+      </w:r>
+      <w:proofErr w:type="spellStart"/>
+      <w:r>
+        <w:t>BLoC</w:t>
+      </w:r>
+      <w:proofErr w:type="spellEnd"/>
+      <w:r>
+        <w:t xml:space="preserve"> pattern with an emerging Clean Architecture, the project reflects the practical, industry-oriented software engineering skills developed throughout the DEPI [Track Name] track. The identified limitations and roadmap in Chapter 5 provide a clear path for continued development beyond the scope of this graduation project.</w:t>
+      </w:r>
+    </w:p>
+    <w:p>
+      <w:pPr>
+        <w:pStyle w:val="Heading1"/>
+      </w:pPr>
+      <w:bookmarkStart w:id="32" w:name="_Toc233839638"/>
+      <w:r>
+        <w:t>References</w:t>
+      </w:r>
+      <w:bookmarkEnd w:id="32"/>
+    </w:p>
+    <w:p>
+      <w:pPr>
+        <w:spacing w:after="200" w:line="288" w:lineRule="auto"/>
+        <w:jc w:val="both"/>
+      </w:pPr>
+      <w:r>
+        <w:t>[1</w:t>
+      </w:r>
+      <w:proofErr w:type="gramStart"/>
+      <w:r>
+        <w:t>]  Flutter</w:t>
+      </w:r>
+      <w:proofErr w:type="gramEnd"/>
+      <w:r>
+        <w:t xml:space="preserve"> Documentation — https://docs.flutter.dev</w:t>
+      </w:r>
+    </w:p>
+    <w:p>
+      <w:pPr>
+        <w:spacing w:after="200" w:line="288" w:lineRule="auto"/>
+        <w:jc w:val="both"/>
+      </w:pPr>
+      <w:r>
+        <w:t>[2</w:t>
+      </w:r>
+      <w:proofErr w:type="gramStart"/>
+      <w:r>
+        <w:t>]  Firebase</w:t>
+      </w:r>
+      <w:proofErr w:type="gramEnd"/>
+      <w:r>
+        <w:t xml:space="preserve"> Documentation — https://firebase.google.com/docs</w:t>
+      </w:r>
+    </w:p>
+    <w:p>
+      <w:pPr>
+        <w:spacing w:after="200" w:line="288" w:lineRule="auto"/>
+        <w:jc w:val="both"/>
+      </w:pPr>
+      <w:r>
+        <w:t>[3</w:t>
+      </w:r>
+      <w:proofErr w:type="gramStart"/>
+      <w:r>
+        <w:t xml:space="preserve">]  </w:t>
+      </w:r>
+      <w:proofErr w:type="spellStart"/>
+      <w:r>
+        <w:t>flutter</w:t>
+      </w:r>
+      <w:proofErr w:type="gramEnd"/>
+      <w:r>
+        <w:t>_bloc</w:t>
+      </w:r>
+      <w:proofErr w:type="spellEnd"/>
+      <w:r>
+        <w:t xml:space="preserve"> Library Documentation — https://bloclibrary.dev</w:t>
+      </w:r>
+    </w:p>
+    <w:p>
+      <w:pPr>
+        <w:spacing w:after="200" w:line="288" w:lineRule="auto"/>
+        <w:jc w:val="both"/>
+      </w:pPr>
+      <w:r>
+        <w:t>[4</w:t>
+      </w:r>
+      <w:proofErr w:type="gramStart"/>
+      <w:r>
+        <w:t xml:space="preserve">]  </w:t>
+      </w:r>
+      <w:proofErr w:type="spellStart"/>
+      <w:r>
+        <w:t>go</w:t>
+      </w:r>
+      <w:proofErr w:type="gramEnd"/>
+      <w:r>
+        <w:t>_router</w:t>
+      </w:r>
+      <w:proofErr w:type="spellEnd"/>
+      <w:r>
+        <w:t xml:space="preserve"> Package — https://pub.dev/packages/go_router</w:t>
+      </w:r>
+    </w:p>
+    <w:p>
+      <w:pPr>
+        <w:spacing w:after="200" w:line="288" w:lineRule="auto"/>
+        <w:jc w:val="both"/>
+      </w:pPr>
+      <w:r>
+        <w:t>[5</w:t>
+      </w:r>
+      <w:proofErr w:type="gramStart"/>
+      <w:r>
+        <w:t xml:space="preserve">]  </w:t>
+      </w:r>
+      <w:proofErr w:type="spellStart"/>
+      <w:r>
+        <w:t>get</w:t>
+      </w:r>
+      <w:proofErr w:type="gramEnd"/>
+      <w:r>
+        <w:t>_</w:t>
+      </w:r>
+      <w:proofErr w:type="gramStart"/>
+      <w:r>
+        <w:t>it</w:t>
+      </w:r>
+      <w:proofErr w:type="spellEnd"/>
+      <w:proofErr w:type="gramEnd"/>
+      <w:r>
+        <w:t xml:space="preserve"> Package — https://pub.dev/packages/get_it</w:t>
+      </w:r>
+    </w:p>
+    <w:p>
+      <w:pPr>
+        <w:spacing w:after="200" w:line="288" w:lineRule="auto"/>
+        <w:jc w:val="both"/>
+      </w:pPr>
+      <w:r>
+        <w:t>[6</w:t>
+      </w:r>
+      <w:proofErr w:type="gramStart"/>
+      <w:r>
+        <w:t>]  Digital</w:t>
+      </w:r>
+      <w:proofErr w:type="gramEnd"/>
+      <w:r>
+        <w:t xml:space="preserve"> Egypt Pioneers Initiative (DEPI) — https://depi.gov.eg</w:t>
+      </w:r>
+    </w:p>
+    <w:p>
+      <w:pPr>
+        <w:pStyle w:val="Heading1"/>
+        <w:rPr>
+          <w:rtl/>
+        </w:rPr>
+      </w:pPr>
+      <w:bookmarkStart w:id="33" w:name="_Toc233839639"/>
+    </w:p>
+    <w:p>
+      <w:pPr>
+        <w:pStyle w:val="Heading1"/>
+        <w:rPr>
+          <w:rtl/>
+        </w:rPr>
+      </w:pPr>
+    </w:p>
+    <w:p>
+      <w:pPr>
+        <w:pStyle w:val="Heading1"/>
+      </w:pPr>
+      <w:r>
+        <w:lastRenderedPageBreak/>
+        <w:t>Appendix A: Project Team</w:t>
+      </w:r>
+      <w:bookmarkEnd w:id="33"/>
     </w:p>
     <w:tbl>
       <w:tblPr>
-        <w:tblW w:w="9026" w:type="dxa"/>
+        <w:tblW w:w="9025" w:type="dxa"/>
         <w:tblBorders>
           <w:top w:val="single" w:sz="4" w:space="0" w:color="BFBFBF"/>
           <w:left w:val="single" w:sz="4" w:space="0" w:color="BFBFBF"/>
@@ -5891,22 +7596,17 @@
         <w:tblLook w:val="0000" w:firstRow="0" w:lastRow="0" w:firstColumn="0" w:lastColumn="0" w:noHBand="0" w:noVBand="0"/>
       </w:tblPr>
       <w:tblGrid>
-        <w:gridCol w:w="2708"/>
-        <w:gridCol w:w="6318"/>
+        <w:gridCol w:w="3160"/>
+        <w:gridCol w:w="5865"/>
       </w:tblGrid>
       <w:tr>
-        <w:tblPrEx>
-          <w:tblCellMar>
-            <w:top w:w="0" w:type="dxa"/>
-            <w:bottom w:w="0" w:type="dxa"/>
-          </w:tblCellMar>
-        </w:tblPrEx>
         <w:trPr>
+          <w:trHeight w:val="389"/>
           <w:tblHeader/>
         </w:trPr>
         <w:tc>
           <w:tcPr>
-            <w:tcW w:w="2708" w:type="dxa"/>
+            <w:tcW w:w="3160" w:type="dxa"/>
             <w:shd w:val="clear" w:color="auto" w:fill="1B2A4A"/>
             <w:tcMar>
               <w:top w:w="100" w:type="dxa"/>
@@ -5925,13 +7625,13 @@
                 <w:sz w:val="20"/>
                 <w:szCs w:val="20"/>
               </w:rPr>
-              <w:t>Screen</w:t>
+              <w:t>Name</w:t>
             </w:r>
           </w:p>
         </w:tc>
         <w:tc>
           <w:tcPr>
-            <w:tcW w:w="6318" w:type="dxa"/>
+            <w:tcW w:w="5865" w:type="dxa"/>
             <w:shd w:val="clear" w:color="auto" w:fill="1B2A4A"/>
             <w:tcMar>
               <w:top w:w="100" w:type="dxa"/>
@@ -5950,21 +7650,18 @@
                 <w:sz w:val="20"/>
                 <w:szCs w:val="20"/>
               </w:rPr>
-              <w:t>Screenshot</w:t>
+              <w:t>Role / Contribution</w:t>
             </w:r>
           </w:p>
         </w:tc>
       </w:tr>
       <w:tr>
-        <w:tblPrEx>
-          <w:tblCellMar>
-            <w:top w:w="0" w:type="dxa"/>
-            <w:bottom w:w="0" w:type="dxa"/>
-          </w:tblCellMar>
-        </w:tblPrEx>
+        <w:trPr>
+          <w:trHeight w:val="389"/>
+        </w:trPr>
         <w:tc>
           <w:tcPr>
-            <w:tcW w:w="2708" w:type="dxa"/>
+            <w:tcW w:w="3160" w:type="dxa"/>
             <w:shd w:val="clear" w:color="auto" w:fill="FFFFFF"/>
             <w:tcMar>
               <w:top w:w="100" w:type="dxa"/>
@@ -5980,13 +7677,13 @@
                 <w:sz w:val="20"/>
                 <w:szCs w:val="20"/>
               </w:rPr>
-              <w:t>Onboarding / Login</w:t>
+              <w:t>Abdulrhman Badwy</w:t>
             </w:r>
           </w:p>
         </w:tc>
         <w:tc>
           <w:tcPr>
-            <w:tcW w:w="6318" w:type="dxa"/>
+            <w:tcW w:w="5865" w:type="dxa"/>
             <w:shd w:val="clear" w:color="auto" w:fill="FFFFFF"/>
             <w:tcMar>
               <w:top w:w="100" w:type="dxa"/>
@@ -5997,26 +7694,64 @@
             <w:vAlign w:val="center"/>
           </w:tcPr>
           <w:p>
-            <w:r>
-              <w:rPr>
-                <w:sz w:val="20"/>
-                <w:szCs w:val="20"/>
-              </w:rPr>
-              <w:t>[Insert screenshot]</w:t>
+            <w:proofErr w:type="gramStart"/>
+            <w:r>
+              <w:rPr>
+                <w:sz w:val="20"/>
+                <w:szCs w:val="20"/>
+              </w:rPr>
+              <w:t>Architecture ,</w:t>
+            </w:r>
+            <w:proofErr w:type="gramEnd"/>
+            <w:r>
+              <w:rPr>
+                <w:sz w:val="20"/>
+                <w:szCs w:val="20"/>
+              </w:rPr>
+              <w:t xml:space="preserve"> UI/</w:t>
+            </w:r>
+            <w:proofErr w:type="gramStart"/>
+            <w:r>
+              <w:rPr>
+                <w:sz w:val="20"/>
+                <w:szCs w:val="20"/>
+              </w:rPr>
+              <w:t>UX ,</w:t>
+            </w:r>
+            <w:proofErr w:type="gramEnd"/>
+            <w:r>
+              <w:rPr>
+                <w:sz w:val="20"/>
+                <w:szCs w:val="20"/>
+              </w:rPr>
+              <w:t xml:space="preserve"> </w:t>
+            </w:r>
+            <w:proofErr w:type="gramStart"/>
+            <w:r>
+              <w:rPr>
+                <w:sz w:val="20"/>
+                <w:szCs w:val="20"/>
+              </w:rPr>
+              <w:t>Rooms ,</w:t>
+            </w:r>
+            <w:proofErr w:type="gramEnd"/>
+            <w:r>
+              <w:rPr>
+                <w:sz w:val="20"/>
+                <w:szCs w:val="20"/>
+              </w:rPr>
+              <w:t xml:space="preserve"> </w:t>
             </w:r>
           </w:p>
         </w:tc>
       </w:tr>
       <w:tr>
-        <w:tblPrEx>
-          <w:tblCellMar>
-            <w:top w:w="0" w:type="dxa"/>
-            <w:bottom w:w="0" w:type="dxa"/>
-          </w:tblCellMar>
-        </w:tblPrEx>
+        <w:trPr>
+          <w:trHeight w:val="432"/>
+        </w:trPr>
         <w:tc>
           <w:tcPr>
-            <w:tcW w:w="2708" w:type="dxa"/>
+            <w:tcW w:w="3160" w:type="dxa"/>
             <w:shd w:val="clear" w:color="auto" w:fill="F2F2F2"/>
             <w:tcMar>
               <w:top w:w="100" w:type="dxa"/>
@@ -6032,13 +7767,13 @@
                 <w:sz w:val="20"/>
                 <w:szCs w:val="20"/>
               </w:rPr>
-              <w:t>Home Dashboard</w:t>
+              <w:t>Mustafa Amr</w:t>
             </w:r>
           </w:p>
         </w:tc>
         <w:tc>
           <w:tcPr>
-            <w:tcW w:w="6318" w:type="dxa"/>
+            <w:tcW w:w="5865" w:type="dxa"/>
             <w:shd w:val="clear" w:color="auto" w:fill="F2F2F2"/>
             <w:tcMar>
               <w:top w:w="100" w:type="dxa"/>
@@ -6049,26 +7784,32 @@
             <w:vAlign w:val="center"/>
           </w:tcPr>
           <w:p>
-            <w:r>
-              <w:rPr>
-                <w:sz w:val="20"/>
-                <w:szCs w:val="20"/>
-              </w:rPr>
-              <w:t>[Insert screenshot]</w:t>
+            <w:proofErr w:type="gramStart"/>
+            <w:r>
+              <w:t>Architecture ,</w:t>
+            </w:r>
+            <w:proofErr w:type="gramEnd"/>
+            <w:r>
+              <w:t xml:space="preserve"> </w:t>
+            </w:r>
+            <w:proofErr w:type="gramStart"/>
+            <w:r>
+              <w:t>Authentication ,</w:t>
+            </w:r>
+            <w:proofErr w:type="gramEnd"/>
+            <w:r>
+              <w:t xml:space="preserve"> UI /UX</w:t>
             </w:r>
           </w:p>
         </w:tc>
       </w:tr>
       <w:tr>
-        <w:tblPrEx>
-          <w:tblCellMar>
-            <w:top w:w="0" w:type="dxa"/>
-            <w:bottom w:w="0" w:type="dxa"/>
-          </w:tblCellMar>
-        </w:tblPrEx>
+        <w:trPr>
+          <w:trHeight w:val="417"/>
+        </w:trPr>
         <w:tc>
           <w:tcPr>
-            <w:tcW w:w="2708" w:type="dxa"/>
+            <w:tcW w:w="3160" w:type="dxa"/>
             <w:shd w:val="clear" w:color="auto" w:fill="FFFFFF"/>
             <w:tcMar>
               <w:top w:w="100" w:type="dxa"/>
@@ -6079,18 +7820,27 @@
             <w:vAlign w:val="center"/>
           </w:tcPr>
           <w:p>
-            <w:r>
-              <w:rPr>
-                <w:sz w:val="20"/>
-                <w:szCs w:val="20"/>
-              </w:rPr>
-              <w:t>Study Room Chat</w:t>
+            <w:proofErr w:type="spellStart"/>
+            <w:r>
+              <w:rPr>
+                <w:sz w:val="20"/>
+                <w:szCs w:val="20"/>
+              </w:rPr>
+              <w:t>Ibraam</w:t>
+            </w:r>
+            <w:proofErr w:type="spellEnd"/>
+            <w:r>
+              <w:rPr>
+                <w:sz w:val="20"/>
+                <w:szCs w:val="20"/>
+              </w:rPr>
+              <w:t xml:space="preserve"> Isaac</w:t>
             </w:r>
           </w:p>
         </w:tc>
         <w:tc>
           <w:tcPr>
-            <w:tcW w:w="6318" w:type="dxa"/>
+            <w:tcW w:w="5865" w:type="dxa"/>
             <w:shd w:val="clear" w:color="auto" w:fill="FFFFFF"/>
             <w:tcMar>
               <w:top w:w="100" w:type="dxa"/>
@@ -6101,26 +7851,45 @@
             <w:vAlign w:val="center"/>
           </w:tcPr>
           <w:p>
-            <w:r>
-              <w:rPr>
-                <w:sz w:val="20"/>
-                <w:szCs w:val="20"/>
-              </w:rPr>
-              <w:t>[Insert screenshot]</w:t>
+            <w:proofErr w:type="gramStart"/>
+            <w:r>
+              <w:t>Architecture ,</w:t>
+            </w:r>
+            <w:proofErr w:type="gramEnd"/>
+            <w:r>
+              <w:t xml:space="preserve"> </w:t>
+            </w:r>
+            <w:proofErr w:type="gramStart"/>
+            <w:r>
+              <w:t>Chat ,</w:t>
+            </w:r>
+            <w:proofErr w:type="gramEnd"/>
+            <w:r>
+              <w:t xml:space="preserve"> </w:t>
+            </w:r>
+            <w:proofErr w:type="spellStart"/>
+            <w:proofErr w:type="gramStart"/>
+            <w:r>
+              <w:t>Quizz</w:t>
+            </w:r>
+            <w:proofErr w:type="spellEnd"/>
+            <w:r>
+              <w:t xml:space="preserve"> ,</w:t>
+            </w:r>
+            <w:proofErr w:type="gramEnd"/>
+            <w:r>
+              <w:t xml:space="preserve"> UI / UX </w:t>
             </w:r>
           </w:p>
         </w:tc>
       </w:tr>
       <w:tr>
-        <w:tblPrEx>
-          <w:tblCellMar>
-            <w:top w:w="0" w:type="dxa"/>
-            <w:bottom w:w="0" w:type="dxa"/>
-          </w:tblCellMar>
-        </w:tblPrEx>
+        <w:trPr>
+          <w:trHeight w:val="389"/>
+        </w:trPr>
         <w:tc>
           <w:tcPr>
-            <w:tcW w:w="2708" w:type="dxa"/>
+            <w:tcW w:w="3160" w:type="dxa"/>
             <w:shd w:val="clear" w:color="auto" w:fill="F2F2F2"/>
             <w:tcMar>
               <w:top w:w="100" w:type="dxa"/>
@@ -6136,13 +7905,13 @@
                 <w:sz w:val="20"/>
                 <w:szCs w:val="20"/>
               </w:rPr>
-              <w:t>Create Quiz</w:t>
+              <w:t>Amr Ahmed</w:t>
             </w:r>
           </w:p>
         </w:tc>
         <w:tc>
           <w:tcPr>
-            <w:tcW w:w="6318" w:type="dxa"/>
+            <w:tcW w:w="5865" w:type="dxa"/>
             <w:shd w:val="clear" w:color="auto" w:fill="F2F2F2"/>
             <w:tcMar>
               <w:top w:w="100" w:type="dxa"/>
@@ -6153,78 +7922,38 @@
             <w:vAlign w:val="center"/>
           </w:tcPr>
           <w:p>
-            <w:r>
-              <w:rPr>
-                <w:sz w:val="20"/>
-                <w:szCs w:val="20"/>
-              </w:rPr>
-              <w:t>[Insert screenshot]</w:t>
+            <w:pPr>
+              <w:rPr>
+                <w:sz w:val="20"/>
+                <w:szCs w:val="20"/>
+              </w:rPr>
+            </w:pPr>
+            <w:proofErr w:type="gramStart"/>
+            <w:r>
+              <w:rPr>
+                <w:sz w:val="20"/>
+                <w:szCs w:val="20"/>
+              </w:rPr>
+              <w:t>Architecture  ,</w:t>
+            </w:r>
+            <w:proofErr w:type="gramEnd"/>
+            <w:r>
+              <w:rPr>
+                <w:sz w:val="20"/>
+                <w:szCs w:val="20"/>
+              </w:rPr>
+              <w:t xml:space="preserve"> dashboard </w:t>
             </w:r>
           </w:p>
         </w:tc>
       </w:tr>
       <w:tr>
-        <w:tblPrEx>
-          <w:tblCellMar>
-            <w:top w:w="0" w:type="dxa"/>
-            <w:bottom w:w="0" w:type="dxa"/>
-          </w:tblCellMar>
-        </w:tblPrEx>
+        <w:trPr>
+          <w:trHeight w:val="389"/>
+        </w:trPr>
         <w:tc>
           <w:tcPr>
-            <w:tcW w:w="2708" w:type="dxa"/>
-            <w:shd w:val="clear" w:color="auto" w:fill="FFFFFF"/>
-            <w:tcMar>
-              <w:top w:w="100" w:type="dxa"/>
-              <w:left w:w="120" w:type="dxa"/>
-              <w:bottom w:w="100" w:type="dxa"/>
-              <w:right w:w="120" w:type="dxa"/>
-            </w:tcMar>
-            <w:vAlign w:val="center"/>
-          </w:tcPr>
-          <w:p>
-            <w:r>
-              <w:rPr>
-                <w:sz w:val="20"/>
-                <w:szCs w:val="20"/>
-              </w:rPr>
-              <w:t>Take Quiz</w:t>
-            </w:r>
-          </w:p>
-        </w:tc>
-        <w:tc>
-          <w:tcPr>
-            <w:tcW w:w="6318" w:type="dxa"/>
-            <w:shd w:val="clear" w:color="auto" w:fill="FFFFFF"/>
-            <w:tcMar>
-              <w:top w:w="100" w:type="dxa"/>
-              <w:left w:w="120" w:type="dxa"/>
-              <w:bottom w:w="100" w:type="dxa"/>
-              <w:right w:w="120" w:type="dxa"/>
-            </w:tcMar>
-            <w:vAlign w:val="center"/>
-          </w:tcPr>
-          <w:p>
-            <w:r>
-              <w:rPr>
-                <w:sz w:val="20"/>
-                <w:szCs w:val="20"/>
-              </w:rPr>
-              <w:t>[Insert screenshot]</w:t>
-            </w:r>
-          </w:p>
-        </w:tc>
-      </w:tr>
-      <w:tr>
-        <w:tblPrEx>
-          <w:tblCellMar>
-            <w:top w:w="0" w:type="dxa"/>
-            <w:bottom w:w="0" w:type="dxa"/>
-          </w:tblCellMar>
-        </w:tblPrEx>
-        <w:tc>
-          <w:tcPr>
-            <w:tcW w:w="2708" w:type="dxa"/>
+            <w:tcW w:w="3160" w:type="dxa"/>
             <w:shd w:val="clear" w:color="auto" w:fill="F2F2F2"/>
             <w:tcMar>
               <w:top w:w="100" w:type="dxa"/>
@@ -6235,19 +7964,24 @@
             <w:vAlign w:val="center"/>
           </w:tcPr>
           <w:p>
-            <w:r>
-              <w:rPr>
-                <w:sz w:val="20"/>
-                <w:szCs w:val="20"/>
-              </w:rPr>
-              <w:lastRenderedPageBreak/>
-              <w:t>Quiz Results / Leaderboard</w:t>
+            <w:pPr>
+              <w:rPr>
+                <w:sz w:val="20"/>
+                <w:szCs w:val="20"/>
+              </w:rPr>
+            </w:pPr>
+            <w:r>
+              <w:rPr>
+                <w:sz w:val="20"/>
+                <w:szCs w:val="20"/>
+              </w:rPr>
+              <w:t>Abdulrhman Mohammed</w:t>
             </w:r>
           </w:p>
         </w:tc>
         <w:tc>
           <w:tcPr>
-            <w:tcW w:w="6318" w:type="dxa"/>
+            <w:tcW w:w="5865" w:type="dxa"/>
             <w:shd w:val="clear" w:color="auto" w:fill="F2F2F2"/>
             <w:tcMar>
               <w:top w:w="100" w:type="dxa"/>
@@ -6258,1122 +7992,50 @@
             <w:vAlign w:val="center"/>
           </w:tcPr>
           <w:p>
-            <w:r>
-              <w:rPr>
-                <w:sz w:val="20"/>
-                <w:szCs w:val="20"/>
-              </w:rPr>
-              <w:t>[Insert screenshot]</w:t>
-            </w:r>
-          </w:p>
-        </w:tc>
-      </w:tr>
-      <w:tr>
-        <w:tblPrEx>
-          <w:tblCellMar>
-            <w:top w:w="0" w:type="dxa"/>
-            <w:bottom w:w="0" w:type="dxa"/>
-          </w:tblCellMar>
-        </w:tblPrEx>
-        <w:tc>
-          <w:tcPr>
-            <w:tcW w:w="2708" w:type="dxa"/>
-            <w:shd w:val="clear" w:color="auto" w:fill="FFFFFF"/>
-            <w:tcMar>
-              <w:top w:w="100" w:type="dxa"/>
-              <w:left w:w="120" w:type="dxa"/>
-              <w:bottom w:w="100" w:type="dxa"/>
-              <w:right w:w="120" w:type="dxa"/>
-            </w:tcMar>
-            <w:vAlign w:val="center"/>
-          </w:tcPr>
-          <w:p>
-            <w:r>
-              <w:rPr>
-                <w:sz w:val="20"/>
-                <w:szCs w:val="20"/>
-              </w:rPr>
-              <w:t>Monitoring Dashboard</w:t>
-            </w:r>
-          </w:p>
-        </w:tc>
-        <w:tc>
-          <w:tcPr>
-            <w:tcW w:w="6318" w:type="dxa"/>
-            <w:shd w:val="clear" w:color="auto" w:fill="FFFFFF"/>
-            <w:tcMar>
-              <w:top w:w="100" w:type="dxa"/>
-              <w:left w:w="120" w:type="dxa"/>
-              <w:bottom w:w="100" w:type="dxa"/>
-              <w:right w:w="120" w:type="dxa"/>
-            </w:tcMar>
-            <w:vAlign w:val="center"/>
-          </w:tcPr>
-          <w:p>
-            <w:r>
-              <w:rPr>
-                <w:sz w:val="20"/>
-                <w:szCs w:val="20"/>
-              </w:rPr>
-              <w:t>[Insert screenshot]</w:t>
-            </w:r>
+            <w:pPr>
+              <w:rPr>
+                <w:sz w:val="20"/>
+                <w:szCs w:val="20"/>
+              </w:rPr>
+            </w:pPr>
+            <w:proofErr w:type="gramStart"/>
+            <w:r>
+              <w:rPr>
+                <w:sz w:val="20"/>
+                <w:szCs w:val="20"/>
+              </w:rPr>
+              <w:t>Architecture ,</w:t>
+            </w:r>
+            <w:proofErr w:type="gramEnd"/>
+            <w:r>
+              <w:rPr>
+                <w:sz w:val="20"/>
+                <w:szCs w:val="20"/>
+              </w:rPr>
+              <w:t xml:space="preserve"> </w:t>
+            </w:r>
+            <w:proofErr w:type="spellStart"/>
+            <w:r>
+              <w:rPr>
+                <w:sz w:val="20"/>
+                <w:szCs w:val="20"/>
+              </w:rPr>
+              <w:t>Quizz</w:t>
+            </w:r>
+            <w:proofErr w:type="spellEnd"/>
           </w:p>
         </w:tc>
       </w:tr>
     </w:tbl>
     <w:p>
-      <w:r>
-        <w:br w:type="page"/>
-      </w:r>
-    </w:p>
-    <w:p>
-      <w:pPr>
-        <w:pStyle w:val="Heading1"/>
-      </w:pPr>
-      <w:bookmarkStart w:id="27" w:name="_Toc233839633"/>
-      <w:r>
-        <w:lastRenderedPageBreak/>
-        <w:t>5. Challenges, Limitations &amp; Future Work</w:t>
-      </w:r>
-      <w:bookmarkEnd w:id="27"/>
-    </w:p>
-    <w:p>
-      <w:pPr>
-        <w:pStyle w:val="Heading2"/>
-      </w:pPr>
-      <w:bookmarkStart w:id="28" w:name="_Toc233839634"/>
-      <w:proofErr w:type="gramStart"/>
-      <w:r>
-        <w:t>5.1  Challenges</w:t>
-      </w:r>
-      <w:proofErr w:type="gramEnd"/>
-      <w:r>
-        <w:t xml:space="preserve"> Faced</w:t>
-      </w:r>
-      <w:bookmarkEnd w:id="28"/>
-    </w:p>
-    <w:p>
-      <w:pPr>
-        <w:pStyle w:val="ListParagraph"/>
-        <w:numPr>
-          <w:ilvl w:val="0"/>
-          <w:numId w:val="2"/>
-        </w:numPr>
-        <w:spacing w:after="120" w:line="276" w:lineRule="auto"/>
-      </w:pPr>
-      <w:r>
-        <w:rPr>
-          <w:b/>
-          <w:bCs/>
-        </w:rPr>
-        <w:t xml:space="preserve">Real-time quiz timing: </w:t>
-      </w:r>
-      <w:r>
-        <w:t xml:space="preserve">Coordinating a live, per-question countdown against </w:t>
-      </w:r>
-      <w:proofErr w:type="spellStart"/>
-      <w:r>
-        <w:t>Firestore's</w:t>
-      </w:r>
-      <w:proofErr w:type="spellEnd"/>
-      <w:r>
-        <w:t xml:space="preserve"> asynchronous, stream-based data model required careful state handling in the Quiz cubits.</w:t>
-      </w:r>
-    </w:p>
-    <w:p>
-      <w:pPr>
-        <w:pStyle w:val="ListParagraph"/>
-        <w:numPr>
-          <w:ilvl w:val="0"/>
-          <w:numId w:val="2"/>
-        </w:numPr>
-        <w:spacing w:after="120" w:line="276" w:lineRule="auto"/>
-      </w:pPr>
-      <w:r>
-        <w:rPr>
-          <w:b/>
-          <w:bCs/>
-        </w:rPr>
-        <w:t xml:space="preserve">Incremental architecture migration: </w:t>
-      </w:r>
-      <w:r>
-        <w:t>Introducing Clean Architecture for the Quiz module while keeping the rest of the app on a simpler repository pattern required a clear internal convention so the two approaches stay consistent and mergeable.</w:t>
-      </w:r>
-    </w:p>
-    <w:p>
-      <w:pPr>
-        <w:pStyle w:val="ListParagraph"/>
-        <w:numPr>
-          <w:ilvl w:val="0"/>
-          <w:numId w:val="2"/>
-        </w:numPr>
-        <w:spacing w:after="120" w:line="276" w:lineRule="auto"/>
-      </w:pPr>
-      <w:r>
-        <w:rPr>
-          <w:b/>
-          <w:bCs/>
-        </w:rPr>
-        <w:t xml:space="preserve">Bilingual RTL/LTR UI: </w:t>
-      </w:r>
-      <w:r>
-        <w:t>Supporting Arabic (RTL) and English (LTR) from the same layout required consistent use of directional-aware widgets rather than hardcoded alignment.</w:t>
-      </w:r>
-    </w:p>
-    <w:p>
-      <w:pPr>
-        <w:spacing w:after="200"/>
-      </w:pPr>
-      <w:r>
-        <w:rPr>
-          <w:i/>
-          <w:iCs/>
-          <w:color w:val="8A8A8A"/>
-        </w:rPr>
-        <w:t xml:space="preserve">[Add any team-specific challenges: Firebase quota/config issues, learning curve with </w:t>
-      </w:r>
-      <w:proofErr w:type="spellStart"/>
-      <w:r>
-        <w:rPr>
-          <w:i/>
-          <w:iCs/>
-          <w:color w:val="8A8A8A"/>
-        </w:rPr>
-        <w:t>BLoC</w:t>
-      </w:r>
-      <w:proofErr w:type="spellEnd"/>
-      <w:r>
-        <w:rPr>
-          <w:i/>
-          <w:iCs/>
-          <w:color w:val="8A8A8A"/>
-        </w:rPr>
-        <w:t xml:space="preserve">, coordinating a shared </w:t>
-      </w:r>
-      <w:proofErr w:type="spellStart"/>
-      <w:r>
-        <w:rPr>
-          <w:i/>
-          <w:iCs/>
-          <w:color w:val="8A8A8A"/>
-        </w:rPr>
-        <w:t>Firestore</w:t>
-      </w:r>
-      <w:proofErr w:type="spellEnd"/>
-      <w:r>
-        <w:rPr>
-          <w:i/>
-          <w:iCs/>
-          <w:color w:val="8A8A8A"/>
-        </w:rPr>
-        <w:t xml:space="preserve"> schema, etc.]</w:t>
-      </w:r>
-    </w:p>
-    <w:p>
-      <w:pPr>
-        <w:pStyle w:val="Heading2"/>
-      </w:pPr>
-      <w:bookmarkStart w:id="29" w:name="_Toc233839635"/>
-      <w:proofErr w:type="gramStart"/>
-      <w:r>
-        <w:t>5.2  Current</w:t>
-      </w:r>
-      <w:proofErr w:type="gramEnd"/>
-      <w:r>
-        <w:t xml:space="preserve"> Limitations</w:t>
-      </w:r>
-      <w:bookmarkEnd w:id="29"/>
-    </w:p>
-    <w:p>
-      <w:pPr>
-        <w:pStyle w:val="ListParagraph"/>
-        <w:numPr>
-          <w:ilvl w:val="0"/>
-          <w:numId w:val="2"/>
-        </w:numPr>
-        <w:spacing w:after="120" w:line="276" w:lineRule="auto"/>
-      </w:pPr>
-      <w:r>
-        <w:rPr>
-          <w:b/>
-          <w:bCs/>
-        </w:rPr>
-        <w:t xml:space="preserve">Notifications &amp; storage: </w:t>
-      </w:r>
-      <w:r>
-        <w:t>Notifications and file/avatar storage are not yet implemented, even though the notifications collection and related UI placeholders already exist.</w:t>
-      </w:r>
-    </w:p>
-    <w:p>
-      <w:pPr>
-        <w:pStyle w:val="ListParagraph"/>
-        <w:numPr>
-          <w:ilvl w:val="0"/>
-          <w:numId w:val="2"/>
-        </w:numPr>
-        <w:spacing w:after="120" w:line="276" w:lineRule="auto"/>
-      </w:pPr>
-      <w:r>
-        <w:rPr>
-          <w:b/>
-          <w:bCs/>
-        </w:rPr>
-        <w:t xml:space="preserve">Incomplete settings destinations: </w:t>
-      </w:r>
-      <w:r>
-        <w:t>The Settings screen's Language, Help Center, and Privacy Policy entries are visible but not yet wired to destination screens.</w:t>
-      </w:r>
-    </w:p>
-    <w:p>
-      <w:pPr>
-        <w:pStyle w:val="ListParagraph"/>
-        <w:numPr>
-          <w:ilvl w:val="0"/>
-          <w:numId w:val="2"/>
-        </w:numPr>
-        <w:spacing w:after="120" w:line="276" w:lineRule="auto"/>
-      </w:pPr>
-      <w:r>
-        <w:rPr>
-          <w:b/>
-          <w:bCs/>
-        </w:rPr>
-        <w:t xml:space="preserve">Chat message deletion: </w:t>
-      </w:r>
-      <w:r>
-        <w:t>Deleting a chat message is defined on the repository layer but not yet implemented end-to-end.</w:t>
-      </w:r>
-    </w:p>
-    <w:p>
-      <w:pPr>
-        <w:pStyle w:val="ListParagraph"/>
-        <w:numPr>
-          <w:ilvl w:val="0"/>
-          <w:numId w:val="2"/>
-        </w:numPr>
-        <w:spacing w:after="120" w:line="276" w:lineRule="auto"/>
-      </w:pPr>
-      <w:r>
-        <w:rPr>
-          <w:b/>
-          <w:bCs/>
-        </w:rPr>
-        <w:t xml:space="preserve">No automated tests: </w:t>
-      </w:r>
-      <w:r>
-        <w:t>Automated unit/widget test coverage has not yet been added.</w:t>
-      </w:r>
-    </w:p>
-    <w:p>
-      <w:pPr>
-        <w:pStyle w:val="ListParagraph"/>
-        <w:numPr>
-          <w:ilvl w:val="0"/>
-          <w:numId w:val="2"/>
-        </w:numPr>
-        <w:spacing w:after="120" w:line="276" w:lineRule="auto"/>
-      </w:pPr>
-      <w:r>
-        <w:rPr>
-          <w:b/>
-          <w:bCs/>
-        </w:rPr>
-        <w:t xml:space="preserve">Security rules: </w:t>
-      </w:r>
-      <w:proofErr w:type="spellStart"/>
-      <w:r>
-        <w:t>Firestore</w:t>
-      </w:r>
-      <w:proofErr w:type="spellEnd"/>
-      <w:r>
-        <w:t xml:space="preserve"> Security Rules enforcing role-based access (student vs. teacher vs. admin) still need to be authored before production use.</w:t>
-      </w:r>
-    </w:p>
-    <w:p>
-      <w:pPr>
-        <w:pStyle w:val="Heading2"/>
-      </w:pPr>
-      <w:bookmarkStart w:id="30" w:name="_Toc233839636"/>
-      <w:proofErr w:type="gramStart"/>
-      <w:r>
-        <w:t>5.3  Future</w:t>
-      </w:r>
-      <w:proofErr w:type="gramEnd"/>
-      <w:r>
-        <w:t xml:space="preserve"> Enhancements</w:t>
-      </w:r>
-      <w:bookmarkEnd w:id="30"/>
-    </w:p>
-    <w:p>
-      <w:pPr>
-        <w:pStyle w:val="ListParagraph"/>
-        <w:numPr>
-          <w:ilvl w:val="0"/>
-          <w:numId w:val="2"/>
-        </w:numPr>
-        <w:spacing w:after="120" w:line="276" w:lineRule="auto"/>
-      </w:pPr>
-      <w:r>
-        <w:rPr>
-          <w:b/>
-          <w:bCs/>
-        </w:rPr>
-        <w:t xml:space="preserve">Notifications: </w:t>
-      </w:r>
-      <w:r>
-        <w:t>Implement push notifications end-to-end, wired to the existing notifications collection.</w:t>
-      </w:r>
-    </w:p>
-    <w:p>
-      <w:pPr>
-        <w:pStyle w:val="ListParagraph"/>
-        <w:numPr>
-          <w:ilvl w:val="0"/>
-          <w:numId w:val="2"/>
-        </w:numPr>
-        <w:spacing w:after="120" w:line="276" w:lineRule="auto"/>
-      </w:pPr>
-      <w:r>
-        <w:rPr>
-          <w:b/>
-          <w:bCs/>
-        </w:rPr>
-        <w:t xml:space="preserve">Profile media: </w:t>
-      </w:r>
-      <w:r>
-        <w:t>Add profile avatar upload via Firebase Storage.</w:t>
-      </w:r>
-    </w:p>
-    <w:p>
-      <w:pPr>
-        <w:pStyle w:val="ListParagraph"/>
-        <w:numPr>
-          <w:ilvl w:val="0"/>
-          <w:numId w:val="2"/>
-        </w:numPr>
-        <w:spacing w:after="120" w:line="276" w:lineRule="auto"/>
-      </w:pPr>
-      <w:r>
-        <w:rPr>
-          <w:b/>
-          <w:bCs/>
-        </w:rPr>
-        <w:t xml:space="preserve">Settings completion: </w:t>
-      </w:r>
-      <w:r>
-        <w:t>Build an in-app language switcher and complete the Help Center / Privacy Policy content.</w:t>
-      </w:r>
-    </w:p>
-    <w:p>
-      <w:pPr>
-        <w:pStyle w:val="ListParagraph"/>
-        <w:numPr>
-          <w:ilvl w:val="0"/>
-          <w:numId w:val="2"/>
-        </w:numPr>
-        <w:spacing w:after="120" w:line="276" w:lineRule="auto"/>
-      </w:pPr>
-      <w:r>
-        <w:rPr>
-          <w:b/>
-          <w:bCs/>
-        </w:rPr>
-        <w:t xml:space="preserve">Architecture migration: </w:t>
-      </w:r>
-      <w:r>
-        <w:t>Migrate Authentication, User, Rooms, and Chat features to the same Clean Architecture pattern established by the Quiz module.</w:t>
-      </w:r>
-    </w:p>
-    <w:p>
-      <w:pPr>
-        <w:pStyle w:val="ListParagraph"/>
-        <w:numPr>
-          <w:ilvl w:val="0"/>
-          <w:numId w:val="2"/>
-        </w:numPr>
-        <w:spacing w:after="120" w:line="276" w:lineRule="auto"/>
-      </w:pPr>
-      <w:r>
-        <w:rPr>
-          <w:b/>
-          <w:bCs/>
-        </w:rPr>
-        <w:t xml:space="preserve">Testing: </w:t>
-      </w:r>
-      <w:r>
-        <w:t xml:space="preserve">Add unit tests </w:t>
-      </w:r>
-      <w:proofErr w:type="gramStart"/>
-      <w:r>
-        <w:t>for use</w:t>
-      </w:r>
-      <w:proofErr w:type="gramEnd"/>
-      <w:r>
-        <w:t xml:space="preserve"> cases/Cubits and widget tests for key screens.</w:t>
-      </w:r>
-    </w:p>
-    <w:p>
-      <w:pPr>
-        <w:pStyle w:val="ListParagraph"/>
-        <w:numPr>
-          <w:ilvl w:val="0"/>
-          <w:numId w:val="2"/>
-        </w:numPr>
-        <w:spacing w:after="120" w:line="276" w:lineRule="auto"/>
-      </w:pPr>
-      <w:r>
-        <w:rPr>
-          <w:b/>
-          <w:bCs/>
-        </w:rPr>
-        <w:t xml:space="preserve">Security hardening: </w:t>
-      </w:r>
-      <w:r>
-        <w:t xml:space="preserve">Author and enforce </w:t>
-      </w:r>
-      <w:proofErr w:type="spellStart"/>
-      <w:r>
-        <w:t>Firestore</w:t>
-      </w:r>
-      <w:proofErr w:type="spellEnd"/>
-      <w:r>
-        <w:t xml:space="preserve"> Security Rules ahead of any production release.</w:t>
-      </w:r>
-    </w:p>
-    <w:p>
-      <w:r>
-        <w:br w:type="page"/>
-      </w:r>
-    </w:p>
-    <w:p>
-      <w:pPr>
-        <w:pStyle w:val="Heading1"/>
-      </w:pPr>
-      <w:bookmarkStart w:id="31" w:name="_Toc233839637"/>
-      <w:r>
-        <w:lastRenderedPageBreak/>
-        <w:t>Conclusion</w:t>
-      </w:r>
-      <w:bookmarkEnd w:id="31"/>
-    </w:p>
-    <w:p>
       <w:pPr>
         <w:spacing w:after="200" w:line="288" w:lineRule="auto"/>
         <w:jc w:val="both"/>
       </w:pPr>
-      <w:proofErr w:type="spellStart"/>
-      <w:r>
-        <w:t>Studex</w:t>
-      </w:r>
-      <w:proofErr w:type="spellEnd"/>
-      <w:r>
-        <w:t xml:space="preserve"> demonstrates a complete, working mobile solution for collaborative studying: students can form study rooms, communicate in real time, assess themselves through quizzes, and see how they compare with peers, while teachers and admins gain visibility into performance through a monitoring dashboard. Built with Flutter and </w:t>
-      </w:r>
-      <w:proofErr w:type="gramStart"/>
-      <w:r>
-        <w:t>Firebase, and</w:t>
-      </w:r>
-      <w:proofErr w:type="gramEnd"/>
-      <w:r>
-        <w:t xml:space="preserve"> structured around the </w:t>
-      </w:r>
-      <w:proofErr w:type="spellStart"/>
-      <w:r>
-        <w:t>BLoC</w:t>
-      </w:r>
-      <w:proofErr w:type="spellEnd"/>
-      <w:r>
-        <w:t xml:space="preserve"> pattern with an emerging Clean Architecture, the project reflects the practical, industry-oriented software engineering skills developed throughout the DEPI [Track Name] track. The identified limitations and roadmap in Chapter 5 provide a clear path for continued development beyond the scope of this graduation project.</w:t>
-      </w:r>
-    </w:p>
-    <w:p>
-      <w:pPr>
-        <w:pStyle w:val="Heading1"/>
-      </w:pPr>
-      <w:bookmarkStart w:id="32" w:name="_Toc233839638"/>
-      <w:r>
-        <w:t>References</w:t>
-      </w:r>
-      <w:bookmarkEnd w:id="32"/>
-    </w:p>
-    <w:p>
-      <w:pPr>
-        <w:spacing w:after="200" w:line="288" w:lineRule="auto"/>
-        <w:jc w:val="both"/>
-      </w:pPr>
-      <w:r>
-        <w:t>[1</w:t>
-      </w:r>
-      <w:proofErr w:type="gramStart"/>
-      <w:r>
-        <w:t>]  Flutter</w:t>
-      </w:r>
-      <w:proofErr w:type="gramEnd"/>
-      <w:r>
-        <w:t xml:space="preserve"> Documentation — https://docs.flutter.dev</w:t>
-      </w:r>
-    </w:p>
-    <w:p>
-      <w:pPr>
-        <w:spacing w:after="200" w:line="288" w:lineRule="auto"/>
-        <w:jc w:val="both"/>
-      </w:pPr>
-      <w:r>
-        <w:t>[2</w:t>
-      </w:r>
-      <w:proofErr w:type="gramStart"/>
-      <w:r>
-        <w:t>]  Firebase</w:t>
-      </w:r>
-      <w:proofErr w:type="gramEnd"/>
-      <w:r>
-        <w:t xml:space="preserve"> Documentation — https://firebase.google.com/docs</w:t>
-      </w:r>
-    </w:p>
-    <w:p>
-      <w:pPr>
-        <w:spacing w:after="200" w:line="288" w:lineRule="auto"/>
-        <w:jc w:val="both"/>
-      </w:pPr>
-      <w:r>
-        <w:t>[3</w:t>
-      </w:r>
-      <w:proofErr w:type="gramStart"/>
-      <w:r>
-        <w:t xml:space="preserve">]  </w:t>
-      </w:r>
-      <w:proofErr w:type="spellStart"/>
-      <w:r>
-        <w:t>flutter</w:t>
-      </w:r>
-      <w:proofErr w:type="gramEnd"/>
-      <w:r>
-        <w:t>_bloc</w:t>
-      </w:r>
-      <w:proofErr w:type="spellEnd"/>
-      <w:r>
-        <w:t xml:space="preserve"> Library Documentation — https://bloclibrary.dev</w:t>
-      </w:r>
-    </w:p>
-    <w:p>
-      <w:pPr>
-        <w:spacing w:after="200" w:line="288" w:lineRule="auto"/>
-        <w:jc w:val="both"/>
-      </w:pPr>
-      <w:r>
-        <w:t>[4</w:t>
-      </w:r>
-      <w:proofErr w:type="gramStart"/>
-      <w:r>
-        <w:t xml:space="preserve">]  </w:t>
-      </w:r>
-      <w:proofErr w:type="spellStart"/>
-      <w:r>
-        <w:t>go</w:t>
-      </w:r>
-      <w:proofErr w:type="gramEnd"/>
-      <w:r>
-        <w:t>_router</w:t>
-      </w:r>
-      <w:proofErr w:type="spellEnd"/>
-      <w:r>
-        <w:t xml:space="preserve"> Package — https://pub.dev/packages/go_router</w:t>
-      </w:r>
-    </w:p>
-    <w:p>
-      <w:pPr>
-        <w:spacing w:after="200" w:line="288" w:lineRule="auto"/>
-        <w:jc w:val="both"/>
-      </w:pPr>
-      <w:r>
-        <w:t>[5</w:t>
-      </w:r>
-      <w:proofErr w:type="gramStart"/>
-      <w:r>
-        <w:t xml:space="preserve">]  </w:t>
-      </w:r>
-      <w:proofErr w:type="spellStart"/>
-      <w:r>
-        <w:t>get</w:t>
-      </w:r>
-      <w:proofErr w:type="gramEnd"/>
-      <w:r>
-        <w:t>_</w:t>
-      </w:r>
-      <w:proofErr w:type="gramStart"/>
-      <w:r>
-        <w:t>it</w:t>
-      </w:r>
-      <w:proofErr w:type="spellEnd"/>
-      <w:proofErr w:type="gramEnd"/>
-      <w:r>
-        <w:t xml:space="preserve"> Package — https://pub.dev/packages/get_it</w:t>
-      </w:r>
-    </w:p>
-    <w:p>
-      <w:pPr>
-        <w:spacing w:after="200" w:line="288" w:lineRule="auto"/>
-        <w:jc w:val="both"/>
-      </w:pPr>
-      <w:r>
-        <w:t>[6</w:t>
-      </w:r>
-      <w:proofErr w:type="gramStart"/>
-      <w:r>
-        <w:t>]  Digital</w:t>
-      </w:r>
-      <w:proofErr w:type="gramEnd"/>
-      <w:r>
-        <w:t xml:space="preserve"> Egypt Pioneers Initiative (DEPI) — https://depi.gov.eg</w:t>
-      </w:r>
-    </w:p>
-    <w:p>
-      <w:r>
-        <w:br w:type="page"/>
-      </w:r>
-    </w:p>
-    <w:p>
-      <w:pPr>
-        <w:pStyle w:val="Heading1"/>
-      </w:pPr>
-      <w:bookmarkStart w:id="33" w:name="_Toc233839639"/>
-      <w:r>
-        <w:lastRenderedPageBreak/>
-        <w:t>Appendix A: Project Team</w:t>
-      </w:r>
-      <w:bookmarkEnd w:id="33"/>
-    </w:p>
-    <w:tbl>
-      <w:tblPr>
-        <w:tblW w:w="9026" w:type="dxa"/>
-        <w:tblBorders>
-          <w:top w:val="single" w:sz="4" w:space="0" w:color="BFBFBF"/>
-          <w:left w:val="single" w:sz="4" w:space="0" w:color="BFBFBF"/>
-          <w:bottom w:val="single" w:sz="4" w:space="0" w:color="BFBFBF"/>
-          <w:right w:val="single" w:sz="4" w:space="0" w:color="BFBFBF"/>
-          <w:insideH w:val="single" w:sz="2" w:space="0" w:color="BFBFBF"/>
-          <w:insideV w:val="single" w:sz="2" w:space="0" w:color="BFBFBF"/>
-        </w:tblBorders>
-        <w:tblCellMar>
-          <w:left w:w="10" w:type="dxa"/>
-          <w:right w:w="10" w:type="dxa"/>
-        </w:tblCellMar>
-        <w:tblLook w:val="0000" w:firstRow="0" w:lastRow="0" w:firstColumn="0" w:lastColumn="0" w:noHBand="0" w:noVBand="0"/>
-      </w:tblPr>
-      <w:tblGrid>
-        <w:gridCol w:w="2600"/>
-        <w:gridCol w:w="4826"/>
-        <w:gridCol w:w="1600"/>
-      </w:tblGrid>
-      <w:tr>
-        <w:tblPrEx>
-          <w:tblCellMar>
-            <w:top w:w="0" w:type="dxa"/>
-            <w:bottom w:w="0" w:type="dxa"/>
-          </w:tblCellMar>
-        </w:tblPrEx>
-        <w:trPr>
-          <w:tblHeader/>
-        </w:trPr>
-        <w:tc>
-          <w:tcPr>
-            <w:tcW w:w="2600" w:type="dxa"/>
-            <w:shd w:val="clear" w:color="auto" w:fill="1B2A4A"/>
-            <w:tcMar>
-              <w:top w:w="100" w:type="dxa"/>
-              <w:left w:w="120" w:type="dxa"/>
-              <w:bottom w:w="100" w:type="dxa"/>
-              <w:right w:w="120" w:type="dxa"/>
-            </w:tcMar>
-            <w:vAlign w:val="center"/>
-          </w:tcPr>
-          <w:p>
-            <w:r>
-              <w:rPr>
-                <w:b/>
-                <w:bCs/>
-                <w:color w:val="FFFFFF"/>
-                <w:sz w:val="20"/>
-                <w:szCs w:val="20"/>
-              </w:rPr>
-              <w:t>Name</w:t>
-            </w:r>
-          </w:p>
-        </w:tc>
-        <w:tc>
-          <w:tcPr>
-            <w:tcW w:w="4826" w:type="dxa"/>
-            <w:shd w:val="clear" w:color="auto" w:fill="1B2A4A"/>
-            <w:tcMar>
-              <w:top w:w="100" w:type="dxa"/>
-              <w:left w:w="120" w:type="dxa"/>
-              <w:bottom w:w="100" w:type="dxa"/>
-              <w:right w:w="120" w:type="dxa"/>
-            </w:tcMar>
-            <w:vAlign w:val="center"/>
-          </w:tcPr>
-          <w:p>
-            <w:r>
-              <w:rPr>
-                <w:b/>
-                <w:bCs/>
-                <w:color w:val="FFFFFF"/>
-                <w:sz w:val="20"/>
-                <w:szCs w:val="20"/>
-              </w:rPr>
-              <w:t>Role / Contribution</w:t>
-            </w:r>
-          </w:p>
-        </w:tc>
-        <w:tc>
-          <w:tcPr>
-            <w:tcW w:w="1600" w:type="dxa"/>
-            <w:shd w:val="clear" w:color="auto" w:fill="1B2A4A"/>
-            <w:tcMar>
-              <w:top w:w="100" w:type="dxa"/>
-              <w:left w:w="120" w:type="dxa"/>
-              <w:bottom w:w="100" w:type="dxa"/>
-              <w:right w:w="120" w:type="dxa"/>
-            </w:tcMar>
-            <w:vAlign w:val="center"/>
-          </w:tcPr>
-          <w:p>
-            <w:r>
-              <w:rPr>
-                <w:b/>
-                <w:bCs/>
-                <w:color w:val="FFFFFF"/>
-                <w:sz w:val="20"/>
-                <w:szCs w:val="20"/>
-              </w:rPr>
-              <w:t>DEPI ID</w:t>
-            </w:r>
-          </w:p>
-        </w:tc>
-      </w:tr>
-      <w:tr>
-        <w:tblPrEx>
-          <w:tblCellMar>
-            <w:top w:w="0" w:type="dxa"/>
-            <w:bottom w:w="0" w:type="dxa"/>
-          </w:tblCellMar>
-        </w:tblPrEx>
-        <w:tc>
-          <w:tcPr>
-            <w:tcW w:w="2600" w:type="dxa"/>
-            <w:shd w:val="clear" w:color="auto" w:fill="FFFFFF"/>
-            <w:tcMar>
-              <w:top w:w="100" w:type="dxa"/>
-              <w:left w:w="120" w:type="dxa"/>
-              <w:bottom w:w="100" w:type="dxa"/>
-              <w:right w:w="120" w:type="dxa"/>
-            </w:tcMar>
-            <w:vAlign w:val="center"/>
-          </w:tcPr>
-          <w:p>
-            <w:r>
-              <w:rPr>
-                <w:sz w:val="20"/>
-                <w:szCs w:val="20"/>
-              </w:rPr>
-              <w:t>[Team Member 1]</w:t>
-            </w:r>
-          </w:p>
-        </w:tc>
-        <w:tc>
-          <w:tcPr>
-            <w:tcW w:w="4826" w:type="dxa"/>
-            <w:shd w:val="clear" w:color="auto" w:fill="FFFFFF"/>
-            <w:tcMar>
-              <w:top w:w="100" w:type="dxa"/>
-              <w:left w:w="120" w:type="dxa"/>
-              <w:bottom w:w="100" w:type="dxa"/>
-              <w:right w:w="120" w:type="dxa"/>
-            </w:tcMar>
-            <w:vAlign w:val="center"/>
-          </w:tcPr>
-          <w:p>
-            <w:r>
-              <w:rPr>
-                <w:sz w:val="20"/>
-                <w:szCs w:val="20"/>
-              </w:rPr>
-              <w:t>[e.g., Mobile Development, Firebase Integration]</w:t>
-            </w:r>
-          </w:p>
-        </w:tc>
-        <w:tc>
-          <w:tcPr>
-            <w:tcW w:w="1600" w:type="dxa"/>
-            <w:shd w:val="clear" w:color="auto" w:fill="FFFFFF"/>
-            <w:tcMar>
-              <w:top w:w="100" w:type="dxa"/>
-              <w:left w:w="120" w:type="dxa"/>
-              <w:bottom w:w="100" w:type="dxa"/>
-              <w:right w:w="120" w:type="dxa"/>
-            </w:tcMar>
-            <w:vAlign w:val="center"/>
-          </w:tcPr>
-          <w:p>
-            <w:r>
-              <w:rPr>
-                <w:sz w:val="20"/>
-                <w:szCs w:val="20"/>
-              </w:rPr>
-              <w:t>[ID]</w:t>
-            </w:r>
-          </w:p>
-        </w:tc>
-      </w:tr>
-      <w:tr>
-        <w:tblPrEx>
-          <w:tblCellMar>
-            <w:top w:w="0" w:type="dxa"/>
-            <w:bottom w:w="0" w:type="dxa"/>
-          </w:tblCellMar>
-        </w:tblPrEx>
-        <w:tc>
-          <w:tcPr>
-            <w:tcW w:w="2600" w:type="dxa"/>
-            <w:shd w:val="clear" w:color="auto" w:fill="F2F2F2"/>
-            <w:tcMar>
-              <w:top w:w="100" w:type="dxa"/>
-              <w:left w:w="120" w:type="dxa"/>
-              <w:bottom w:w="100" w:type="dxa"/>
-              <w:right w:w="120" w:type="dxa"/>
-            </w:tcMar>
-            <w:vAlign w:val="center"/>
-          </w:tcPr>
-          <w:p>
-            <w:r>
-              <w:rPr>
-                <w:sz w:val="20"/>
-                <w:szCs w:val="20"/>
-              </w:rPr>
-              <w:t>[Team Member 2]</w:t>
-            </w:r>
-          </w:p>
-        </w:tc>
-        <w:tc>
-          <w:tcPr>
-            <w:tcW w:w="4826" w:type="dxa"/>
-            <w:shd w:val="clear" w:color="auto" w:fill="F2F2F2"/>
-            <w:tcMar>
-              <w:top w:w="100" w:type="dxa"/>
-              <w:left w:w="120" w:type="dxa"/>
-              <w:bottom w:w="100" w:type="dxa"/>
-              <w:right w:w="120" w:type="dxa"/>
-            </w:tcMar>
-            <w:vAlign w:val="center"/>
-          </w:tcPr>
-          <w:p>
-            <w:r>
-              <w:rPr>
-                <w:sz w:val="20"/>
-                <w:szCs w:val="20"/>
-              </w:rPr>
-              <w:t>[e.g., UI/UX, Quiz Module]</w:t>
-            </w:r>
-          </w:p>
-        </w:tc>
-        <w:tc>
-          <w:tcPr>
-            <w:tcW w:w="1600" w:type="dxa"/>
-            <w:shd w:val="clear" w:color="auto" w:fill="F2F2F2"/>
-            <w:tcMar>
-              <w:top w:w="100" w:type="dxa"/>
-              <w:left w:w="120" w:type="dxa"/>
-              <w:bottom w:w="100" w:type="dxa"/>
-              <w:right w:w="120" w:type="dxa"/>
-            </w:tcMar>
-            <w:vAlign w:val="center"/>
-          </w:tcPr>
-          <w:p>
-            <w:r>
-              <w:rPr>
-                <w:sz w:val="20"/>
-                <w:szCs w:val="20"/>
-              </w:rPr>
-              <w:t>[ID]</w:t>
-            </w:r>
-          </w:p>
-        </w:tc>
-      </w:tr>
-      <w:tr>
-        <w:tblPrEx>
-          <w:tblCellMar>
-            <w:top w:w="0" w:type="dxa"/>
-            <w:bottom w:w="0" w:type="dxa"/>
-          </w:tblCellMar>
-        </w:tblPrEx>
-        <w:tc>
-          <w:tcPr>
-            <w:tcW w:w="2600" w:type="dxa"/>
-            <w:shd w:val="clear" w:color="auto" w:fill="FFFFFF"/>
-            <w:tcMar>
-              <w:top w:w="100" w:type="dxa"/>
-              <w:left w:w="120" w:type="dxa"/>
-              <w:bottom w:w="100" w:type="dxa"/>
-              <w:right w:w="120" w:type="dxa"/>
-            </w:tcMar>
-            <w:vAlign w:val="center"/>
-          </w:tcPr>
-          <w:p>
-            <w:r>
-              <w:rPr>
-                <w:sz w:val="20"/>
-                <w:szCs w:val="20"/>
-              </w:rPr>
-              <w:t>[Team Member 3]</w:t>
-            </w:r>
-          </w:p>
-        </w:tc>
-        <w:tc>
-          <w:tcPr>
-            <w:tcW w:w="4826" w:type="dxa"/>
-            <w:shd w:val="clear" w:color="auto" w:fill="FFFFFF"/>
-            <w:tcMar>
-              <w:top w:w="100" w:type="dxa"/>
-              <w:left w:w="120" w:type="dxa"/>
-              <w:bottom w:w="100" w:type="dxa"/>
-              <w:right w:w="120" w:type="dxa"/>
-            </w:tcMar>
-            <w:vAlign w:val="center"/>
-          </w:tcPr>
-          <w:p>
-            <w:r>
-              <w:rPr>
-                <w:sz w:val="20"/>
-                <w:szCs w:val="20"/>
-              </w:rPr>
-              <w:t>[e.g., Authentication, Chat Module]</w:t>
-            </w:r>
-          </w:p>
-        </w:tc>
-        <w:tc>
-          <w:tcPr>
-            <w:tcW w:w="1600" w:type="dxa"/>
-            <w:shd w:val="clear" w:color="auto" w:fill="FFFFFF"/>
-            <w:tcMar>
-              <w:top w:w="100" w:type="dxa"/>
-              <w:left w:w="120" w:type="dxa"/>
-              <w:bottom w:w="100" w:type="dxa"/>
-              <w:right w:w="120" w:type="dxa"/>
-            </w:tcMar>
-            <w:vAlign w:val="center"/>
-          </w:tcPr>
-          <w:p>
-            <w:r>
-              <w:rPr>
-                <w:sz w:val="20"/>
-                <w:szCs w:val="20"/>
-              </w:rPr>
-              <w:t>[ID]</w:t>
-            </w:r>
-          </w:p>
-        </w:tc>
-      </w:tr>
-      <w:tr>
-        <w:tblPrEx>
-          <w:tblCellMar>
-            <w:top w:w="0" w:type="dxa"/>
-            <w:bottom w:w="0" w:type="dxa"/>
-          </w:tblCellMar>
-        </w:tblPrEx>
-        <w:tc>
-          <w:tcPr>
-            <w:tcW w:w="2600" w:type="dxa"/>
-            <w:shd w:val="clear" w:color="auto" w:fill="F2F2F2"/>
-            <w:tcMar>
-              <w:top w:w="100" w:type="dxa"/>
-              <w:left w:w="120" w:type="dxa"/>
-              <w:bottom w:w="100" w:type="dxa"/>
-              <w:right w:w="120" w:type="dxa"/>
-            </w:tcMar>
-            <w:vAlign w:val="center"/>
-          </w:tcPr>
-          <w:p>
-            <w:r>
-              <w:rPr>
-                <w:sz w:val="20"/>
-                <w:szCs w:val="20"/>
-              </w:rPr>
-              <w:t>[Team Member 4]</w:t>
-            </w:r>
-          </w:p>
-        </w:tc>
-        <w:tc>
-          <w:tcPr>
-            <w:tcW w:w="4826" w:type="dxa"/>
-            <w:shd w:val="clear" w:color="auto" w:fill="F2F2F2"/>
-            <w:tcMar>
-              <w:top w:w="100" w:type="dxa"/>
-              <w:left w:w="120" w:type="dxa"/>
-              <w:bottom w:w="100" w:type="dxa"/>
-              <w:right w:w="120" w:type="dxa"/>
-            </w:tcMar>
-            <w:vAlign w:val="center"/>
-          </w:tcPr>
-          <w:p>
-            <w:r>
-              <w:rPr>
-                <w:sz w:val="20"/>
-                <w:szCs w:val="20"/>
-              </w:rPr>
-              <w:t>[e.g., Monitoring Dashboard, Testing]</w:t>
-            </w:r>
-          </w:p>
-        </w:tc>
-        <w:tc>
-          <w:tcPr>
-            <w:tcW w:w="1600" w:type="dxa"/>
-            <w:shd w:val="clear" w:color="auto" w:fill="F2F2F2"/>
-            <w:tcMar>
-              <w:top w:w="100" w:type="dxa"/>
-              <w:left w:w="120" w:type="dxa"/>
-              <w:bottom w:w="100" w:type="dxa"/>
-              <w:right w:w="120" w:type="dxa"/>
-            </w:tcMar>
-            <w:vAlign w:val="center"/>
-          </w:tcPr>
-          <w:p>
-            <w:r>
-              <w:rPr>
-                <w:sz w:val="20"/>
-                <w:szCs w:val="20"/>
-              </w:rPr>
-              <w:t>[ID]</w:t>
-            </w:r>
-          </w:p>
-        </w:tc>
-      </w:tr>
-    </w:tbl>
-    <w:p>
-      <w:pPr>
-        <w:spacing w:before="300"/>
-      </w:pPr>
-    </w:p>
-    <w:p>
-      <w:pPr>
-        <w:spacing w:after="200" w:line="288" w:lineRule="auto"/>
-        <w:jc w:val="both"/>
-      </w:pPr>
-      <w:r>
-        <w:t>Supervisor: [Supervisor Name]</w:t>
-      </w:r>
-    </w:p>
-    <w:p>
-      <w:pPr>
-        <w:spacing w:after="200" w:line="288" w:lineRule="auto"/>
-        <w:jc w:val="both"/>
-      </w:pPr>
-      <w:r>
-        <w:t>Acknowledgment: [Add any thanks to DEPI instructors, mentors, or partner organizations.]</w:t>
-      </w:r>
     </w:p>
     <w:sectPr>
-      <w:headerReference w:type="default" r:id="rId10"/>
-      <w:footerReference w:type="default" r:id="rId11"/>
+      <w:headerReference w:type="default" r:id="rId35"/>
+      <w:footerReference w:type="default" r:id="rId36"/>
       <w:pgSz w:w="11906" w:h="16838"/>
       <w:pgMar w:top="1440" w:right="1440" w:bottom="1440" w:left="1440" w:header="708" w:footer="708" w:gutter="0"/>
       <w:cols w:space="720"/>

</xml_diff>